<commit_message>
Cap nhat toan bo 11 anh minh chung thuc te va bao cao hoan thien
</commit_message>
<xml_diff>
--- a/N24DCDT018_DT012_DoHongDuong_BaoCao.docx
+++ b/N24DCDT018_DT012_DoHongDuong_BaoCao.docx
@@ -98,61 +98,7 @@
           <w:color w:val="000000"/>
           <w:sz w:val="40"/>
         </w:rPr>
-        <w:t>BÁO CÁO Đ</w:t>
-      </w:r>
-      <w:r>
-        <w:rPr>
-          <w:rFonts w:ascii="Times New Roman" w:hAnsi="Times New Roman"/>
-          <w:b/>
-          <w:color w:val="000000"/>
-          <w:sz w:val="40"/>
-        </w:rPr>
-        <w:t>Ồ</w:t>
-      </w:r>
-      <w:r>
-        <w:rPr>
-          <w:rFonts w:ascii="Times New Roman" w:hAnsi="Times New Roman"/>
-          <w:b/>
-          <w:color w:val="000000"/>
-          <w:sz w:val="40"/>
-        </w:rPr>
-        <w:t xml:space="preserve"> ÁN H</w:t>
-      </w:r>
-      <w:r>
-        <w:rPr>
-          <w:rFonts w:ascii="Times New Roman" w:hAnsi="Times New Roman"/>
-          <w:b/>
-          <w:color w:val="000000"/>
-          <w:sz w:val="40"/>
-        </w:rPr>
-        <w:t>Ọ</w:t>
-      </w:r>
-      <w:r>
-        <w:rPr>
-          <w:rFonts w:ascii="Times New Roman" w:hAnsi="Times New Roman"/>
-          <w:b/>
-          <w:color w:val="000000"/>
-          <w:sz w:val="40"/>
-        </w:rPr>
-        <w:t>C PH</w:t>
-      </w:r>
-      <w:r>
-        <w:rPr>
-          <w:rFonts w:ascii="Times New Roman" w:hAnsi="Times New Roman"/>
-          <w:b/>
-          <w:color w:val="000000"/>
-          <w:sz w:val="40"/>
-        </w:rPr>
-        <w:t>Ầ</w:t>
-      </w:r>
-      <w:r>
-        <w:rPr>
-          <w:rFonts w:ascii="Times New Roman" w:hAnsi="Times New Roman"/>
-          <w:b/>
-          <w:color w:val="000000"/>
-          <w:sz w:val="40"/>
-        </w:rPr>
-        <w:t>N</w:t>
+        <w:t>BÁO CÁO ĐỒ ÁN HỌC PHẦN</w:t>
       </w:r>
     </w:p>
     <w:p>
@@ -312,10 +258,7 @@
               <w:spacing w:after="40" w:line="252" w:lineRule="auto"/>
             </w:pPr>
             <w:r>
-              <w:t xml:space="preserve">Giảng </w:t>
-            </w:r>
-            <w:r>
-              <w:t>viên hướng dẫn</w:t>
+              <w:t>Giảng viên hướng dẫn</w:t>
             </w:r>
           </w:p>
         </w:tc>
@@ -598,61 +541,7 @@
           <w:color w:val="000000"/>
           <w:sz w:val="40"/>
         </w:rPr>
-        <w:t>BÁO CÁO Đ</w:t>
-      </w:r>
-      <w:r>
-        <w:rPr>
-          <w:rFonts w:ascii="Times New Roman" w:hAnsi="Times New Roman"/>
-          <w:b/>
-          <w:color w:val="000000"/>
-          <w:sz w:val="40"/>
-        </w:rPr>
-        <w:t>Ồ</w:t>
-      </w:r>
-      <w:r>
-        <w:rPr>
-          <w:rFonts w:ascii="Times New Roman" w:hAnsi="Times New Roman"/>
-          <w:b/>
-          <w:color w:val="000000"/>
-          <w:sz w:val="40"/>
-        </w:rPr>
-        <w:t xml:space="preserve"> ÁN H</w:t>
-      </w:r>
-      <w:r>
-        <w:rPr>
-          <w:rFonts w:ascii="Times New Roman" w:hAnsi="Times New Roman"/>
-          <w:b/>
-          <w:color w:val="000000"/>
-          <w:sz w:val="40"/>
-        </w:rPr>
-        <w:t>Ọ</w:t>
-      </w:r>
-      <w:r>
-        <w:rPr>
-          <w:rFonts w:ascii="Times New Roman" w:hAnsi="Times New Roman"/>
-          <w:b/>
-          <w:color w:val="000000"/>
-          <w:sz w:val="40"/>
-        </w:rPr>
-        <w:t>C PH</w:t>
-      </w:r>
-      <w:r>
-        <w:rPr>
-          <w:rFonts w:ascii="Times New Roman" w:hAnsi="Times New Roman"/>
-          <w:b/>
-          <w:color w:val="000000"/>
-          <w:sz w:val="40"/>
-        </w:rPr>
-        <w:t>Ầ</w:t>
-      </w:r>
-      <w:r>
-        <w:rPr>
-          <w:rFonts w:ascii="Times New Roman" w:hAnsi="Times New Roman"/>
-          <w:b/>
-          <w:color w:val="000000"/>
-          <w:sz w:val="40"/>
-        </w:rPr>
-        <w:t>N</w:t>
+        <w:t>BÁO CÁO ĐỒ ÁN HỌC PHẦN</w:t>
       </w:r>
     </w:p>
     <w:p>
@@ -1097,13 +986,7 @@
         <w:rPr>
           <w:b/>
         </w:rPr>
-        <w:t xml:space="preserve">Học phần INT13185   Nhóm 03   Giảng viên Hồ </w:t>
-      </w:r>
-      <w:r>
-        <w:rPr>
-          <w:b/>
-        </w:rPr>
-        <w:t>Nhựt Minh</w:t>
+        <w:t>Học phần INT13185   Nhóm 03   Giảng viên Hồ Nhựt Minh</w:t>
       </w:r>
     </w:p>
     <w:tbl>
@@ -1278,13 +1161,7 @@
               <w:rPr>
                 <w:sz w:val="22"/>
               </w:rPr>
-              <w:t xml:space="preserve">Chương 2, Mục 2.2.3; bảng 2.3; mục 2.8 bài </w:t>
-            </w:r>
-            <w:r>
-              <w:rPr>
-                <w:sz w:val="22"/>
-              </w:rPr>
-              <w:t>16,17,19; trang in 37–39, 61; trang PDF 49–51, 73</w:t>
+              <w:t>Chương 2, Mục 2.2.3; bảng 2.3; mục 2.8 bài 16,17,19; trang in 37–39, 61; trang PDF 49–51, 73</w:t>
             </w:r>
           </w:p>
         </w:tc>
@@ -1513,10 +1390,7 @@
         <w:jc w:val="left"/>
       </w:pPr>
       <w:r>
-        <w:t xml:space="preserve">Dùng rubric chung và hướng dẫn minh chứng </w:t>
-      </w:r>
-      <w:r>
-        <w:t>đúng mã đề trong tệp 00_HUONG_DAN_SINH_VIEN.html. Không tự điền điểm khi chưa được chấm.</w:t>
+        <w:t>Dùng rubric chung và hướng dẫn minh chứng đúng mã đề trong tệp 00_HUONG_DAN_SINH_VIEN.html. Không tự điền điểm khi chưa được chấm.</w:t>
       </w:r>
     </w:p>
     <w:tbl>
@@ -1857,13 +1731,7 @@
               <w:rPr>
                 <w:sz w:val="24"/>
               </w:rPr>
-              <w:t xml:space="preserve">Thuật toán </w:t>
-            </w:r>
-            <w:r>
-              <w:rPr>
-                <w:sz w:val="24"/>
-              </w:rPr>
-              <w:t>và truy vết</w:t>
+              <w:t>Thuật toán và truy vết</w:t>
             </w:r>
           </w:p>
         </w:tc>
@@ -2242,13 +2110,7 @@
         <w:rPr>
           <w:sz w:val="24"/>
         </w:rPr>
-        <w:t xml:space="preserve">Quy đổi từng tiêu chí = điểm /10 × trọng số. Hai người chấm lấy trung </w:t>
-      </w:r>
-      <w:r>
-        <w:rPr>
-          <w:sz w:val="24"/>
-        </w:rPr>
-        <w:t>bình điểm; một người chấm ghi rõ. Tổng điểm ....../10. Nhận xét ...................................................................</w:t>
+        <w:t>Quy đổi từng tiêu chí = điểm /10 × trọng số. Hai người chấm lấy trung bình điểm; một người chấm ghi rõ. Tổng điểm ....../10. Nhận xét ...................................................................</w:t>
       </w:r>
     </w:p>
     <w:p>
@@ -2360,13 +2222,7 @@
         <w:rPr>
           <w:sz w:val="23"/>
         </w:rPr>
-        <w:t xml:space="preserve">Đầy đủ: Biểu diễn phù hợp; thao tác bắt buộc tự cài đủ; chỉ số/liên kết/trạng thái và bất biến đúng; công cụ có sẵn dùng trong phạm vi phiếu. Một phần: Biểu diễn chính </w:t>
-      </w:r>
-      <w:r>
-        <w:rPr>
-          <w:sz w:val="23"/>
-        </w:rPr>
-        <w:t>dùng được nhưng còn thiếu thao tác, kiểm tra, bất biến hoặc giải thích phần tự cài. Chưa có: Chưa có biểu diễn hoạt động được hoặc chưa xác định được phần tự cài cần kiểm.</w:t>
+        <w:t>Đầy đủ: Biểu diễn phù hợp; thao tác bắt buộc tự cài đủ; chỉ số/liên kết/trạng thái và bất biến đúng; công cụ có sẵn dùng trong phạm vi phiếu. Một phần: Biểu diễn chính dùng được nhưng còn thiếu thao tác, kiểm tra, bất biến hoặc giải thích phần tự cài. Chưa có: Chưa có biểu diễn hoạt động được hoặc chưa xác định được phần tự cài cần kiểm.</w:t>
       </w:r>
     </w:p>
     <w:p>
@@ -2594,10 +2450,7 @@
       <w:bookmarkStart w:id="4" w:name="_Toc243125610"/>
       <w:r>
         <w:lastRenderedPageBreak/>
-        <w:t xml:space="preserve">LỜI </w:t>
-      </w:r>
-      <w:r>
-        <w:t>CAM ĐOAN</w:t>
+        <w:t>LỜI CAM ĐOAN</w:t>
       </w:r>
       <w:bookmarkEnd w:id="4"/>
     </w:p>
@@ -2734,43 +2587,7 @@
           <w:sz w:val="32"/>
         </w:rPr>
         <w:lastRenderedPageBreak/>
-        <w:t>M</w:t>
-      </w:r>
-      <w:r>
-        <w:rPr>
-          <w:rFonts w:ascii="Times New Roman" w:hAnsi="Times New Roman"/>
-          <w:b/>
-          <w:color w:val="000000"/>
-          <w:sz w:val="32"/>
-        </w:rPr>
-        <w:t>Ụ</w:t>
-      </w:r>
-      <w:r>
-        <w:rPr>
-          <w:rFonts w:ascii="Times New Roman" w:hAnsi="Times New Roman"/>
-          <w:b/>
-          <w:color w:val="000000"/>
-          <w:sz w:val="32"/>
-        </w:rPr>
-        <w:t>C L</w:t>
-      </w:r>
-      <w:r>
-        <w:rPr>
-          <w:rFonts w:ascii="Times New Roman" w:hAnsi="Times New Roman"/>
-          <w:b/>
-          <w:color w:val="000000"/>
-          <w:sz w:val="32"/>
-        </w:rPr>
-        <w:t>Ụ</w:t>
-      </w:r>
-      <w:r>
-        <w:rPr>
-          <w:rFonts w:ascii="Times New Roman" w:hAnsi="Times New Roman"/>
-          <w:b/>
-          <w:color w:val="000000"/>
-          <w:sz w:val="32"/>
-        </w:rPr>
-        <w:t>C</w:t>
+        <w:t>MỤC LỤC</w:t>
       </w:r>
     </w:p>
     <w:p>
@@ -5215,7 +5032,7 @@
             <w:webHidden/>
             <w:sz w:val="24"/>
           </w:rPr>
-          <w:t>13</w:t>
+          <w:t>14</w:t>
         </w:r>
         <w:r>
           <w:rPr>
@@ -5299,7 +5116,7 @@
             <w:webHidden/>
             <w:sz w:val="24"/>
           </w:rPr>
-          <w:t>14</w:t>
+          <w:t>16</w:t>
         </w:r>
         <w:r>
           <w:rPr>
@@ -5383,7 +5200,7 @@
             <w:webHidden/>
             <w:sz w:val="24"/>
           </w:rPr>
-          <w:t>15</w:t>
+          <w:t>18</w:t>
         </w:r>
         <w:r>
           <w:rPr>
@@ -5467,7 +5284,7 @@
             <w:webHidden/>
             <w:sz w:val="24"/>
           </w:rPr>
-          <w:t>16</w:t>
+          <w:t>18</w:t>
         </w:r>
         <w:r>
           <w:rPr>
@@ -5551,7 +5368,7 @@
             <w:webHidden/>
             <w:sz w:val="24"/>
           </w:rPr>
-          <w:t>16</w:t>
+          <w:t>19</w:t>
         </w:r>
         <w:r>
           <w:rPr>
@@ -5635,7 +5452,7 @@
             <w:webHidden/>
             <w:sz w:val="24"/>
           </w:rPr>
-          <w:t>18</w:t>
+          <w:t>21</w:t>
         </w:r>
         <w:r>
           <w:rPr>
@@ -5719,7 +5536,7 @@
             <w:webHidden/>
             <w:sz w:val="24"/>
           </w:rPr>
-          <w:t>20</w:t>
+          <w:t>23</w:t>
         </w:r>
         <w:r>
           <w:rPr>
@@ -5803,7 +5620,7 @@
             <w:webHidden/>
             <w:sz w:val="24"/>
           </w:rPr>
-          <w:t>20</w:t>
+          <w:t>23</w:t>
         </w:r>
         <w:r>
           <w:rPr>
@@ -5887,7 +5704,7 @@
             <w:webHidden/>
             <w:sz w:val="24"/>
           </w:rPr>
-          <w:t>20</w:t>
+          <w:t>23</w:t>
         </w:r>
         <w:r>
           <w:rPr>
@@ -5971,7 +5788,7 @@
             <w:webHidden/>
             <w:sz w:val="24"/>
           </w:rPr>
-          <w:t>20</w:t>
+          <w:t>23</w:t>
         </w:r>
         <w:r>
           <w:rPr>
@@ -6055,7 +5872,7 @@
             <w:webHidden/>
             <w:sz w:val="24"/>
           </w:rPr>
-          <w:t>21</w:t>
+          <w:t>24</w:t>
         </w:r>
         <w:r>
           <w:rPr>
@@ -6519,115 +6336,7 @@
           <w:sz w:val="32"/>
         </w:rPr>
         <w:lastRenderedPageBreak/>
-        <w:t>DANH M</w:t>
-      </w:r>
-      <w:r>
-        <w:rPr>
-          <w:rFonts w:ascii="Times New Roman" w:hAnsi="Times New Roman"/>
-          <w:b/>
-          <w:color w:val="000000"/>
-          <w:sz w:val="32"/>
-        </w:rPr>
-        <w:t>Ụ</w:t>
-      </w:r>
-      <w:r>
-        <w:rPr>
-          <w:rFonts w:ascii="Times New Roman" w:hAnsi="Times New Roman"/>
-          <w:b/>
-          <w:color w:val="000000"/>
-          <w:sz w:val="32"/>
-        </w:rPr>
-        <w:t>C THU</w:t>
-      </w:r>
-      <w:r>
-        <w:rPr>
-          <w:rFonts w:ascii="Times New Roman" w:hAnsi="Times New Roman"/>
-          <w:b/>
-          <w:color w:val="000000"/>
-          <w:sz w:val="32"/>
-        </w:rPr>
-        <w:t>Ậ</w:t>
-      </w:r>
-      <w:r>
-        <w:rPr>
-          <w:rFonts w:ascii="Times New Roman" w:hAnsi="Times New Roman"/>
-          <w:b/>
-          <w:color w:val="000000"/>
-          <w:sz w:val="32"/>
-        </w:rPr>
-        <w:t>T NG</w:t>
-      </w:r>
-      <w:r>
-        <w:rPr>
-          <w:rFonts w:ascii="Times New Roman" w:hAnsi="Times New Roman"/>
-          <w:b/>
-          <w:color w:val="000000"/>
-          <w:sz w:val="32"/>
-        </w:rPr>
-        <w:t>Ữ</w:t>
-      </w:r>
-      <w:r>
-        <w:rPr>
-          <w:rFonts w:ascii="Times New Roman" w:hAnsi="Times New Roman"/>
-          <w:b/>
-          <w:color w:val="000000"/>
-          <w:sz w:val="32"/>
-        </w:rPr>
-        <w:t xml:space="preserve"> VÀ CH</w:t>
-      </w:r>
-      <w:r>
-        <w:rPr>
-          <w:rFonts w:ascii="Times New Roman" w:hAnsi="Times New Roman"/>
-          <w:b/>
-          <w:color w:val="000000"/>
-          <w:sz w:val="32"/>
-        </w:rPr>
-        <w:t>Ữ</w:t>
-      </w:r>
-      <w:r>
-        <w:rPr>
-          <w:rFonts w:ascii="Times New Roman" w:hAnsi="Times New Roman"/>
-          <w:b/>
-          <w:color w:val="000000"/>
-          <w:sz w:val="32"/>
-        </w:rPr>
-        <w:t xml:space="preserve"> VI</w:t>
-      </w:r>
-      <w:r>
-        <w:rPr>
-          <w:rFonts w:ascii="Times New Roman" w:hAnsi="Times New Roman"/>
-          <w:b/>
-          <w:color w:val="000000"/>
-          <w:sz w:val="32"/>
-        </w:rPr>
-        <w:t>Ế</w:t>
-      </w:r>
-      <w:r>
-        <w:rPr>
-          <w:rFonts w:ascii="Times New Roman" w:hAnsi="Times New Roman"/>
-          <w:b/>
-          <w:color w:val="000000"/>
-          <w:sz w:val="32"/>
-        </w:rPr>
-        <w:t>T T</w:t>
-      </w:r>
-      <w:r>
-        <w:rPr>
-          <w:rFonts w:ascii="Times New Roman" w:hAnsi="Times New Roman"/>
-          <w:b/>
-          <w:color w:val="000000"/>
-          <w:sz w:val="32"/>
-        </w:rPr>
-        <w:t>Ắ</w:t>
-      </w:r>
-      <w:r>
-        <w:rPr>
-          <w:rFonts w:ascii="Times New Roman" w:hAnsi="Times New Roman"/>
-          <w:b/>
-          <w:color w:val="000000"/>
-          <w:sz w:val="32"/>
-        </w:rPr>
-        <w:t>T</w:t>
+        <w:t>DANH MỤC THUẬT NGỮ VÀ CHỮ VIẾT TẮT</w:t>
       </w:r>
     </w:p>
     <w:tbl>
@@ -6762,13 +6471,7 @@
               <w:rPr>
                 <w:sz w:val="22"/>
               </w:rPr>
-              <w:t xml:space="preserve">Dữ liệu đầu vào và </w:t>
-            </w:r>
-            <w:r>
-              <w:rPr>
-                <w:sz w:val="22"/>
-              </w:rPr>
-              <w:t>đầu ra (Input / Output)</w:t>
+              <w:t>Dữ liệu đầu vào và đầu ra (Input / Output)</w:t>
             </w:r>
           </w:p>
         </w:tc>
@@ -6864,25 +6567,7 @@
           <w:sz w:val="32"/>
         </w:rPr>
         <w:lastRenderedPageBreak/>
-        <w:t>DANH SÁCH B</w:t>
-      </w:r>
-      <w:r>
-        <w:rPr>
-          <w:rFonts w:ascii="Times New Roman" w:hAnsi="Times New Roman"/>
-          <w:b/>
-          <w:color w:val="000000"/>
-          <w:sz w:val="32"/>
-        </w:rPr>
-        <w:t>Ả</w:t>
-      </w:r>
-      <w:r>
-        <w:rPr>
-          <w:rFonts w:ascii="Times New Roman" w:hAnsi="Times New Roman"/>
-          <w:b/>
-          <w:color w:val="000000"/>
-          <w:sz w:val="32"/>
-        </w:rPr>
-        <w:t>NG</w:t>
+        <w:t>DANH SÁCH BẢNG</w:t>
       </w:r>
     </w:p>
     <w:p>
@@ -7899,7 +7584,7 @@
             <w:webHidden/>
             <w:sz w:val="24"/>
           </w:rPr>
-          <w:t>16</w:t>
+          <w:t>19</w:t>
         </w:r>
         <w:r>
           <w:rPr>
@@ -7983,7 +7668,7 @@
             <w:webHidden/>
             <w:sz w:val="24"/>
           </w:rPr>
-          <w:t>18</w:t>
+          <w:t>21</w:t>
         </w:r>
         <w:r>
           <w:rPr>
@@ -8067,7 +7752,7 @@
             <w:webHidden/>
             <w:sz w:val="24"/>
           </w:rPr>
-          <w:t>20</w:t>
+          <w:t>23</w:t>
         </w:r>
         <w:r>
           <w:rPr>
@@ -8425,10 +8110,7 @@
         </w:rPr>
       </w:pPr>
       <w:r>
-        <w:t xml:space="preserve">Hình 4.9 Tổng kết kiểm thử Đỗ </w:t>
-      </w:r>
-      <w:r>
-        <w:t>Hồng Dương - DT012</w:t>
+        <w:t>Hình 4.9 Tổng kết kiểm thử Đỗ Hồng Dương - DT012</w:t>
       </w:r>
       <w:r>
         <w:tab/>
@@ -8519,10 +8201,7 @@
       </w:pPr>
       <w:bookmarkStart w:id="8" w:name="_Toc243125614"/>
       <w:r>
-        <w:t xml:space="preserve">1.1. Bài toán và lý do thực </w:t>
-      </w:r>
-      <w:r>
-        <w:t>hiện</w:t>
+        <w:t>1.1. Bài toán và lý do thực hiện</w:t>
       </w:r>
       <w:bookmarkEnd w:id="8"/>
     </w:p>
@@ -8574,10 +8253,7 @@
         <w:pStyle w:val="Nidung"/>
       </w:pPr>
       <w:r>
-        <w:t xml:space="preserve">Liệt kê từng </w:t>
-      </w:r>
-      <w:r>
-        <w:t>chức năng bắt buộc từ phiếu; với mỗi chức năng, nêu output hoặc điều kiện hoàn thành kiểm được. Nêu mã chạy, bộ test, báo cáo và repo.</w:t>
+        <w:t>Liệt kê từng chức năng bắt buộc từ phiếu; với mỗi chức năng, nêu output hoặc điều kiện hoàn thành kiểm được. Nêu mã chạy, bộ test, báo cáo và repo.</w:t>
       </w:r>
     </w:p>
     <w:p>
@@ -8907,13 +8583,7 @@
               <w:rPr>
                 <w:sz w:val="22"/>
               </w:rPr>
-              <w:t>Int, 0 &lt;= n</w:t>
-            </w:r>
-            <w:r>
-              <w:rPr>
-                <w:sz w:val="22"/>
-              </w:rPr>
-              <w:t xml:space="preserve"> &lt;= 5000</w:t>
+              <w:t>Int, 0 &lt;= n &lt;= 5000</w:t>
             </w:r>
           </w:p>
         </w:tc>
@@ -9318,13 +8988,7 @@
         <w:rPr>
           <w:sz w:val="24"/>
         </w:rPr>
-        <w:t xml:space="preserve">Input được nhập bàn phím, khai báo trực tiếp hoặc truyền tham số theo phiếu; thuật toán không phụ thuộc CSV/Excel hay tệp dữ liệu ngoài. Nếu trường hợp </w:t>
-      </w:r>
-      <w:r>
-        <w:rPr>
-          <w:sz w:val="24"/>
-        </w:rPr>
-        <w:t>hòa/vô nghiệm/rỗng không áp dụng, ghi Không áp dụng và nêu lý do.</w:t>
+        <w:t>Input được nhập bàn phím, khai báo trực tiếp hoặc truyền tham số theo phiếu; thuật toán không phụ thuộc CSV/Excel hay tệp dữ liệu ngoài. Nếu trường hợp hòa/vô nghiệm/rỗng không áp dụng, ghi Không áp dụng và nêu lý do.</w:t>
       </w:r>
     </w:p>
     <w:p>
@@ -9689,10 +9353,7 @@
         <w:pStyle w:val="Nidung"/>
       </w:pPr>
       <w:r>
-        <w:t xml:space="preserve">Định nghĩa các đối </w:t>
-      </w:r>
-      <w:r>
-        <w:t>tượng của đúng đề: số, mảng, dãy con, trạng thái, nút, cây hoặc đồ thị. Ghi ký hiệu n và tham số phụ; dẫn mục/trang giáo trình.</w:t>
+        <w:t>Định nghĩa các đối tượng của đúng đề: số, mảng, dãy con, trạng thái, nút, cây hoặc đồ thị. Ghi ký hiệu n và tham số phụ; dẫn mục/trang giáo trình.</w:t>
       </w:r>
     </w:p>
     <w:p>
@@ -9987,13 +9648,7 @@
               <w:rPr>
                 <w:sz w:val="22"/>
               </w:rPr>
-              <w:t xml:space="preserve">Chỉ số </w:t>
-            </w:r>
-            <w:r>
-              <w:rPr>
-                <w:sz w:val="22"/>
-              </w:rPr>
-              <w:t>duyệt mảng và chỉ số lùi</w:t>
+              <w:t>Chỉ số duyệt mảng và chỉ số lùi</w:t>
             </w:r>
           </w:p>
         </w:tc>
@@ -10115,14 +9770,7 @@
           <w:sz w:val="28"/>
         </w:rPr>
         <w:lastRenderedPageBreak/>
-        <w:t xml:space="preserve">Cơ sở thuật toán và giới hạn áp </w:t>
-      </w:r>
-      <w:r>
-        <w:rPr>
-          <w:b/>
-          <w:sz w:val="28"/>
-        </w:rPr>
-        <w:t>dụng</w:t>
+        <w:t>Cơ sở thuật toán và giới hạn áp dụng</w:t>
       </w:r>
     </w:p>
     <w:p>
@@ -10454,10 +10102,7 @@
       </w:pPr>
       <w:bookmarkStart w:id="24" w:name="_Toc243125654"/>
       <w:r>
-        <w:t xml:space="preserve">Bảng 3.1 Tổ chức các </w:t>
-      </w:r>
-      <w:r>
-        <w:t>hàm và tệp</w:t>
+        <w:t>Bảng 3.1 Tổ chức các hàm và tệp</w:t>
       </w:r>
       <w:bookmarkEnd w:id="24"/>
     </w:p>
@@ -10687,13 +10332,7 @@
               <w:rPr>
                 <w:sz w:val="22"/>
               </w:rPr>
-              <w:t>Dịch chuyển phần tử &gt;</w:t>
-            </w:r>
-            <w:r>
-              <w:rPr>
-                <w:sz w:val="22"/>
-              </w:rPr>
-              <w:t xml:space="preserve"> x và đặt x vào vị trí hợp lệ</w:t>
+              <w:t>Dịch chuyển phần tử &gt; x và đặt x vào vị trí hợp lệ</w:t>
             </w:r>
           </w:p>
         </w:tc>
@@ -11142,13 +10781,7 @@
               <w:rPr>
                 <w:sz w:val="22"/>
               </w:rPr>
-              <w:t xml:space="preserve">a[1:i-1] đã </w:t>
-            </w:r>
-            <w:r>
-              <w:rPr>
-                <w:sz w:val="22"/>
-              </w:rPr>
-              <w:t>tăng, 2 &lt;= i &lt;= n</w:t>
+              <w:t>a[1:i-1] đã tăng, 2 &lt;= i &lt;= n</w:t>
             </w:r>
           </w:p>
         </w:tc>
@@ -11308,13 +10941,7 @@
         <w:rPr>
           <w:sz w:val="24"/>
         </w:rPr>
-        <w:t xml:space="preserve">Hàm có thể là một hàm tính toán với biến số; không bắt buộc tạo lớp, cây, đồ thị hoặc cấu trúc ngoài phiếu. Ghi rõ dữ liệu nào bị thay đổi và thao tác nào </w:t>
-      </w:r>
-      <w:r>
-        <w:rPr>
-          <w:sz w:val="24"/>
-        </w:rPr>
-        <w:t>phải tự cài.</w:t>
+        <w:t>Hàm có thể là một hàm tính toán với biến số; không bắt buộc tạo lớp, cây, đồ thị hoặc cấu trúc ngoài phiếu. Ghi rõ dữ liệu nào bị thay đổi và thao tác nào phải tự cài.</w:t>
       </w:r>
     </w:p>
     <w:p>
@@ -11542,14 +11169,7 @@
           <w:sz w:val="28"/>
         </w:rPr>
         <w:lastRenderedPageBreak/>
-        <w:t xml:space="preserve">Lần vết, tính đúng và </w:t>
-      </w:r>
-      <w:r>
-        <w:rPr>
-          <w:b/>
-          <w:sz w:val="28"/>
-        </w:rPr>
-        <w:t>chi phí</w:t>
+        <w:t>Lần vết, tính đúng và chi phí</w:t>
       </w:r>
     </w:p>
     <w:p>
@@ -11897,13 +11517,7 @@
               <w:rPr>
                 <w:sz w:val="22"/>
               </w:rPr>
-              <w:t xml:space="preserve">Tiền tố a[1] </w:t>
-            </w:r>
-            <w:r>
-              <w:rPr>
-                <w:sz w:val="22"/>
-              </w:rPr>
-              <w:t>gồm [4] đã được sắp xếp tăng dần</w:t>
+              <w:t>Tiền tố a[1] gồm [4] đã được sắp xếp tăng dần</w:t>
             </w:r>
           </w:p>
         </w:tc>
@@ -12053,13 +11667,7 @@
               <w:rPr>
                 <w:sz w:val="22"/>
               </w:rPr>
-              <w:t>So sánh a[2]=4 &gt; 3 -&gt; dịch 4; so sánh a[1]=1 &lt;= 3</w:t>
-            </w:r>
-            <w:r>
-              <w:rPr>
-                <w:sz w:val="22"/>
-              </w:rPr>
-              <w:t xml:space="preserve"> -&gt; dừng; chèn 3 vào ô 2</w:t>
+              <w:t>So sánh a[2]=4 &gt; 3 -&gt; dịch 4; so sánh a[1]=1 &lt;= 3 -&gt; dừng; chèn 3 vào ô 2</w:t>
             </w:r>
           </w:p>
         </w:tc>
@@ -12160,13 +11768,7 @@
             <w:rPr>
               <w:sz w:val="24"/>
             </w:rPr>
-            <w:t xml:space="preserve">[SV ĐIỀN: lần vết đến khi dừng; giải thích thay đổi của từng biến/trạng thái, </w:t>
-          </w:r>
-          <w:r>
-            <w:rPr>
-              <w:sz w:val="24"/>
-            </w:rPr>
-            <w:t>output cuối và vì sao khớp expected. Với đệ quy hoặc bảng, thể hiện lời gọi hoặc ô tương ứng.]</w:t>
+            <w:t>[SV ĐIỀN: lần vết đến khi dừng; giải thích thay đổi của từng biến/trạng thái, output cuối và vì sao khớp expected. Với đệ quy hoặc bảng, thể hiện lời gọi hoặc ô tương ứng.]</w:t>
           </w:r>
         </w:sdtContent>
       </w:sdt>
@@ -12322,10 +11924,7 @@
       </w:pPr>
       <w:bookmarkStart w:id="31" w:name="_Toc243125657"/>
       <w:r>
-        <w:t xml:space="preserve">Bảng 3.4 Chi phí của từng pha </w:t>
-      </w:r>
-      <w:r>
-        <w:t>trong bản cài</w:t>
+        <w:t>Bảng 3.4 Chi phí của từng pha trong bản cài</w:t>
       </w:r>
       <w:bookmarkEnd w:id="31"/>
     </w:p>
@@ -12650,13 +12249,7 @@
               <w:rPr>
                 <w:sz w:val="22"/>
               </w:rPr>
-              <w:t>n - 1 +</w:t>
-            </w:r>
-            <w:r>
-              <w:rPr>
-                <w:sz w:val="22"/>
-              </w:rPr>
-              <w:t xml:space="preserve"> k so sánh, k lần dịch</w:t>
+              <w:t>n - 1 + k so sánh, k lần dịch</w:t>
             </w:r>
           </w:p>
         </w:tc>
@@ -12851,13 +12444,7 @@
         <w:rPr>
           <w:sz w:val="24"/>
         </w:rPr>
-        <w:t xml:space="preserve">Tách lõi thuật toán khỏi chuẩn </w:t>
-      </w:r>
-      <w:r>
-        <w:rPr>
-          <w:sz w:val="24"/>
-        </w:rPr>
-        <w:t>bị/sắp/kiểm/in khi các bước đó tồn tại. Nêu bộ nhớ phụ và cách tính kích thước kết quả; không khẳng định chi phí chỉ từ số đo nhỏ. Dòng không áp dụng ghi rõ lý do.</w:t>
+        <w:t>Tách lõi thuật toán khỏi chuẩn bị/sắp/kiểm/in khi các bước đó tồn tại. Nêu bộ nhớ phụ và cách tính kích thước kết quả; không khẳng định chi phí chỉ từ số đo nhỏ. Dòng không áp dụng ghi rõ lý do.</w:t>
       </w:r>
     </w:p>
     <w:p>
@@ -12937,10 +12524,7 @@
         <w:pStyle w:val="Nidung"/>
       </w:pPr>
       <w:r>
-        <w:t xml:space="preserve">Nêu tính tay, cách giải độc lập </w:t>
-      </w:r>
-      <w:r>
-        <w:t>hoặc điều kiện nghiệm; giải thích cách so sánh khi nhiều nghiệm và sai số nếu dùng số thực.</w:t>
+        <w:t>Nêu tính tay, cách giải độc lập hoặc điều kiện nghiệm; giải thích cách so sánh khi nhiều nghiệm và sai số nếu dùng số thực.</w:t>
       </w:r>
     </w:p>
     <w:p>
@@ -12983,10 +12567,7 @@
         <w:pStyle w:val="Nidung"/>
       </w:pPr>
       <w:r>
-        <w:t xml:space="preserve">Điền bảng cho &gt;=12 ca kiểm thử độc lập, bao gồm hai ví dụ và toàn bộ năm ca trên </w:t>
-      </w:r>
-      <w:r>
-        <w:t>phiếu; bổ sung đủ nhóm tám ảnh. Có thể xoay bảng ở trang riêng nếu cần, giữ cỡ chữ đọc được. Không dùng số assert thay số ca.</w:t>
+        <w:t>Điền bảng cho &gt;=12 ca kiểm thử độc lập, bao gồm hai ví dụ và toàn bộ năm ca trên phiếu; bổ sung đủ nhóm tám ảnh. Có thể xoay bảng ở trang riêng nếu cần, giữ cỡ chữ đọc được. Không dùng số assert thay số ca.</w:t>
       </w:r>
     </w:p>
     <w:p>
@@ -13500,13 +13081,7 @@
         <w:rPr>
           <w:sz w:val="24"/>
         </w:rPr>
-        <w:t xml:space="preserve">Khi miền chương trình chính quá hẹp, bổ sung ca hàm con, validator hoặc bất biến có mục tiêu và kỳ vọng riêng để đủ số ca; ghi rõ đối </w:t>
-      </w:r>
-      <w:r>
-        <w:rPr>
-          <w:sz w:val="24"/>
-        </w:rPr>
-        <w:t>tượng. Không đổi nhãn cùng phép kiểm để tăng số ca và không tính số assert là số ca.</w:t>
+        <w:t>Khi miền chương trình chính quá hẹp, bổ sung ca hàm con, validator hoặc bất biến có mục tiêu và kỳ vọng riêng để đủ số ca; ghi rõ đối tượng. Không đổi nhãn cùng phép kiểm để tăng số ca và không tính số assert là số ca.</w:t>
       </w:r>
     </w:p>
     <w:p>
@@ -13686,13 +13261,7 @@
               <w:rPr>
                 <w:sz w:val="22"/>
               </w:rPr>
-              <w:t xml:space="preserve">Ra [1, 2, 3, 4], 6 so </w:t>
-            </w:r>
-            <w:r>
-              <w:rPr>
-                <w:sz w:val="22"/>
-              </w:rPr>
-              <w:t>sánh, 4 dịch; kiểm issorted</w:t>
+              <w:t>Ra [1, 2, 3, 4], 6 so sánh, 4 dịch; kiểm issorted</w:t>
             </w:r>
           </w:p>
         </w:tc>
@@ -13861,13 +13430,7 @@
               <w:rPr>
                 <w:sz w:val="22"/>
               </w:rPr>
-              <w:t xml:space="preserve">[2, </w:t>
-            </w:r>
-            <w:r>
-              <w:rPr>
-                <w:sz w:val="22"/>
-              </w:rPr>
-              <w:t>1, 4, 3, 6, 5]</w:t>
+              <w:t>[2, 1, 4, 3, 6, 5]</w:t>
             </w:r>
           </w:p>
         </w:tc>
@@ -14036,13 +13599,7 @@
               <w:rPr>
                 <w:sz w:val="22"/>
               </w:rPr>
-              <w:t xml:space="preserve">Ca biên 3 (Trùng hoàn </w:t>
-            </w:r>
-            <w:r>
-              <w:rPr>
-                <w:sz w:val="22"/>
-              </w:rPr>
-              <w:t>toàn)</w:t>
+              <w:t>Ca biên 3 (Trùng hoàn toàn)</w:t>
             </w:r>
           </w:p>
         </w:tc>
@@ -14375,13 +13932,7 @@
               <w:rPr>
                 <w:sz w:val="22"/>
               </w:rPr>
-              <w:t xml:space="preserve">Ra </w:t>
-            </w:r>
-            <w:r>
-              <w:rPr>
-                <w:sz w:val="22"/>
-              </w:rPr>
-              <w:t>[(1,'B'), (2,'A'), (2,'C')], giữ nguyên thứ tự A trước C</w:t>
+              <w:t>Ra [(1,'B'), (2,'A'), (2,'C')], giữ nguyên thứ tự A trước C</w:t>
             </w:r>
           </w:p>
         </w:tc>
@@ -14635,13 +14186,7 @@
               <w:rPr>
                 <w:sz w:val="22"/>
               </w:rPr>
-              <w:t xml:space="preserve">Hình 4.2 | </w:t>
-            </w:r>
-            <w:r>
-              <w:rPr>
-                <w:sz w:val="22"/>
-              </w:rPr>
-              <w:t>SHA: 72b4a97</w:t>
+              <w:t>Hình 4.2 | SHA: 72b4a97</w:t>
             </w:r>
           </w:p>
         </w:tc>
@@ -14885,13 +14430,7 @@
               <w:rPr>
                 <w:sz w:val="22"/>
               </w:rPr>
-              <w:t xml:space="preserve">Hình 4.6 | SHA: </w:t>
-            </w:r>
-            <w:r>
-              <w:rPr>
-                <w:sz w:val="22"/>
-              </w:rPr>
-              <w:t>72b4a97</w:t>
+              <w:t>Hình 4.6 | SHA: 72b4a97</w:t>
             </w:r>
           </w:p>
         </w:tc>
@@ -15135,13 +14674,7 @@
               <w:rPr>
                 <w:sz w:val="22"/>
               </w:rPr>
-              <w:t xml:space="preserve">Hình 4.9 | </w:t>
-            </w:r>
-            <w:r>
-              <w:rPr>
-                <w:sz w:val="22"/>
-              </w:rPr>
-              <w:t>SHA: 72b4a97</w:t>
+              <w:t>Hình 4.9 | SHA: 72b4a97</w:t>
             </w:r>
           </w:p>
         </w:tc>
@@ -15461,10 +14994,10 @@
                 <w:noProof/>
               </w:rPr>
               <w:drawing>
-                <wp:inline distT="0" distB="0" distL="0" distR="0" wp14:anchorId="354A8CD1" wp14:editId="0808F8EF">
-                  <wp:extent cx="5120640" cy="2240924"/>
+                <wp:inline distT="0" distB="0" distL="0" distR="0" wp14:anchorId="57CAA233" wp14:editId="13BD5286">
+                  <wp:extent cx="5120640" cy="3125474"/>
                   <wp:effectExtent l="0" t="0" r="0" b="0"/>
-                  <wp:docPr id="1" name="Picture 1"/>
+                  <wp:docPr id="12" name="Picture 12"/>
                   <wp:cNvGraphicFramePr>
                     <a:graphicFrameLocks xmlns:a="http://schemas.openxmlformats.org/drawingml/2006/main" noChangeAspect="1"/>
                   </wp:cNvGraphicFramePr>
@@ -15484,7 +15017,7 @@
                         <pic:spPr>
                           <a:xfrm>
                             <a:off x="0" y="0"/>
-                            <a:ext cx="5120640" cy="2240924"/>
+                            <a:ext cx="5120640" cy="3125474"/>
                           </a:xfrm>
                           <a:prstGeom prst="rect">
                             <a:avLst/>
@@ -15545,13 +15078,7 @@
             <w:rPr>
               <w:sz w:val="24"/>
             </w:rPr>
-            <w:t xml:space="preserve">[Mã ca/đối tượng; input; expected; actual; lệnh chạy; </w:t>
-          </w:r>
-          <w:r>
-            <w:rPr>
-              <w:sz w:val="24"/>
-            </w:rPr>
-            <w:t>đường dẫn ảnh; SHA C. Viết ít nhất hai câu nhận xét giải thích đúng kết quả.]</w:t>
+            <w:t>[Mã ca/đối tượng; input; expected; actual; lệnh chạy; đường dẫn ảnh; SHA C. Viết ít nhất hai câu nhận xét giải thích đúng kết quả.]</w:t>
           </w:r>
         </w:sdtContent>
       </w:sdt>
@@ -15738,11 +15265,12 @@
               <w:rPr>
                 <w:noProof/>
               </w:rPr>
+              <w:lastRenderedPageBreak/>
               <w:drawing>
-                <wp:inline distT="0" distB="0" distL="0" distR="0" wp14:anchorId="5B42AC7C" wp14:editId="27DFEBB6">
-                  <wp:extent cx="5120640" cy="2240924"/>
+                <wp:inline distT="0" distB="0" distL="0" distR="0" wp14:anchorId="6113A9E8" wp14:editId="4A6A1135">
+                  <wp:extent cx="5120640" cy="3125474"/>
                   <wp:effectExtent l="0" t="0" r="0" b="0"/>
-                  <wp:docPr id="2" name="Picture 2"/>
+                  <wp:docPr id="13" name="Picture 13"/>
                   <wp:cNvGraphicFramePr>
                     <a:graphicFrameLocks xmlns:a="http://schemas.openxmlformats.org/drawingml/2006/main" noChangeAspect="1"/>
                   </wp:cNvGraphicFramePr>
@@ -15762,7 +15290,7 @@
                         <pic:spPr>
                           <a:xfrm>
                             <a:off x="0" y="0"/>
-                            <a:ext cx="5120640" cy="2240924"/>
+                            <a:ext cx="5120640" cy="3125474"/>
                           </a:xfrm>
                           <a:prstGeom prst="rect">
                             <a:avLst/>
@@ -15879,13 +15407,7 @@
             <w:rPr>
               <w:sz w:val="24"/>
             </w:rPr>
-            <w:t xml:space="preserve">[VIẾT NỘI DUNG CỦA </w:t>
-          </w:r>
-          <w:r>
-            <w:rPr>
-              <w:sz w:val="24"/>
-            </w:rPr>
-            <w:t>SINH VIÊN TẠI ĐÂY]</w:t>
+            <w:t>[VIẾT NỘI DUNG CỦA SINH VIÊN TẠI ĐÂY]</w:t>
           </w:r>
         </w:sdtContent>
       </w:sdt>
@@ -15933,10 +15455,10 @@
                 <w:noProof/>
               </w:rPr>
               <w:drawing>
-                <wp:inline distT="0" distB="0" distL="0" distR="0" wp14:anchorId="546276B7" wp14:editId="60711CE6">
-                  <wp:extent cx="5120640" cy="2333133"/>
+                <wp:inline distT="0" distB="0" distL="0" distR="0" wp14:anchorId="6222F59E" wp14:editId="7235A6A8">
+                  <wp:extent cx="5120640" cy="3125474"/>
                   <wp:effectExtent l="0" t="0" r="0" b="0"/>
-                  <wp:docPr id="3" name="Picture 3"/>
+                  <wp:docPr id="14" name="Picture 14"/>
                   <wp:cNvGraphicFramePr>
                     <a:graphicFrameLocks xmlns:a="http://schemas.openxmlformats.org/drawingml/2006/main" noChangeAspect="1"/>
                   </wp:cNvGraphicFramePr>
@@ -15956,7 +15478,7 @@
                         <pic:spPr>
                           <a:xfrm>
                             <a:off x="0" y="0"/>
-                            <a:ext cx="5120640" cy="2333133"/>
+                            <a:ext cx="5120640" cy="3125474"/>
                           </a:xfrm>
                           <a:prstGeom prst="rect">
                             <a:avLst/>
@@ -16035,10 +15557,7 @@
         <w:pStyle w:val="Nidung"/>
       </w:pPr>
       <w:r>
-        <w:t xml:space="preserve">Thiết kế input có diễn tiến </w:t>
-      </w:r>
-      <w:r>
-        <w:t>khác TK01 và hai ví dụ; giải thích vì sao ca bổ sung khả năng phát hiện lỗi. Chèn A04, ghi kết luận dựa expected/actual.</w:t>
+        <w:t>Thiết kế input có diễn tiến khác TK01 và hai ví dụ; giải thích vì sao ca bổ sung khả năng phát hiện lỗi. Chèn A04, ghi kết luận dựa expected/actual.</w:t>
       </w:r>
     </w:p>
     <w:p>
@@ -16108,11 +15627,12 @@
               <w:rPr>
                 <w:noProof/>
               </w:rPr>
+              <w:lastRenderedPageBreak/>
               <w:drawing>
-                <wp:inline distT="0" distB="0" distL="0" distR="0" wp14:anchorId="6E6E9C43" wp14:editId="246DA815">
-                  <wp:extent cx="5120640" cy="2445450"/>
+                <wp:inline distT="0" distB="0" distL="0" distR="0" wp14:anchorId="0F476954" wp14:editId="41A07D61">
+                  <wp:extent cx="5120640" cy="3125474"/>
                   <wp:effectExtent l="0" t="0" r="0" b="0"/>
-                  <wp:docPr id="4" name="Picture 4"/>
+                  <wp:docPr id="15" name="Picture 15"/>
                   <wp:cNvGraphicFramePr>
                     <a:graphicFrameLocks xmlns:a="http://schemas.openxmlformats.org/drawingml/2006/main" noChangeAspect="1"/>
                   </wp:cNvGraphicFramePr>
@@ -16132,7 +15652,7 @@
                         <pic:spPr>
                           <a:xfrm>
                             <a:off x="0" y="0"/>
-                            <a:ext cx="5120640" cy="2445450"/>
+                            <a:ext cx="5120640" cy="3125474"/>
                           </a:xfrm>
                           <a:prstGeom prst="rect">
                             <a:avLst/>
@@ -16226,10 +15746,7 @@
         <w:pStyle w:val="Nidung"/>
       </w:pPr>
       <w:r>
-        <w:t xml:space="preserve">Chọn biên hợp lệ phù hợp với miền phiếu, nêu điều kiện tối thiểu hoặc nhánh đặc biệt được kiểm. Chèn A05, </w:t>
-      </w:r>
-      <w:r>
-        <w:t>tính expected và giải thích actual.</w:t>
+        <w:t>Chọn biên hợp lệ phù hợp với miền phiếu, nêu điều kiện tối thiểu hoặc nhánh đặc biệt được kiểm. Chèn A05, tính expected và giải thích actual.</w:t>
       </w:r>
     </w:p>
     <w:p>
@@ -16333,10 +15850,10 @@
                 <w:noProof/>
               </w:rPr>
               <w:drawing>
-                <wp:inline distT="0" distB="0" distL="0" distR="0" wp14:anchorId="1DD5FD48" wp14:editId="356269DB">
-                  <wp:extent cx="5120640" cy="1546913"/>
+                <wp:inline distT="0" distB="0" distL="0" distR="0" wp14:anchorId="44F6BF1D" wp14:editId="490EA350">
+                  <wp:extent cx="5120640" cy="3125474"/>
                   <wp:effectExtent l="0" t="0" r="0" b="0"/>
-                  <wp:docPr id="5" name="Picture 5"/>
+                  <wp:docPr id="16" name="Picture 16"/>
                   <wp:cNvGraphicFramePr>
                     <a:graphicFrameLocks xmlns:a="http://schemas.openxmlformats.org/drawingml/2006/main" noChangeAspect="1"/>
                   </wp:cNvGraphicFramePr>
@@ -16356,7 +15873,7 @@
                         <pic:spPr>
                           <a:xfrm>
                             <a:off x="0" y="0"/>
-                            <a:ext cx="5120640" cy="1546913"/>
+                            <a:ext cx="5120640" cy="3125474"/>
                           </a:xfrm>
                           <a:prstGeom prst="rect">
                             <a:avLst/>
@@ -16505,11 +16022,12 @@
               <w:rPr>
                 <w:noProof/>
               </w:rPr>
+              <w:lastRenderedPageBreak/>
               <w:drawing>
-                <wp:inline distT="0" distB="0" distL="0" distR="0" wp14:anchorId="1B83C0F7" wp14:editId="288E855F">
-                  <wp:extent cx="5120640" cy="1546913"/>
+                <wp:inline distT="0" distB="0" distL="0" distR="0" wp14:anchorId="519BFD7E" wp14:editId="6858A4E9">
+                  <wp:extent cx="5120640" cy="3125474"/>
                   <wp:effectExtent l="0" t="0" r="0" b="0"/>
-                  <wp:docPr id="6" name="Picture 6"/>
+                  <wp:docPr id="17" name="Picture 17"/>
                   <wp:cNvGraphicFramePr>
                     <a:graphicFrameLocks xmlns:a="http://schemas.openxmlformats.org/drawingml/2006/main" noChangeAspect="1"/>
                   </wp:cNvGraphicFramePr>
@@ -16529,7 +16047,7 @@
                         <pic:spPr>
                           <a:xfrm>
                             <a:off x="0" y="0"/>
-                            <a:ext cx="5120640" cy="1546913"/>
+                            <a:ext cx="5120640" cy="3125474"/>
                           </a:xfrm>
                           <a:prstGeom prst="rect">
                             <a:avLst/>
@@ -16641,10 +16159,7 @@
         <w:pStyle w:val="Nidung"/>
       </w:pPr>
       <w:r>
-        <w:t xml:space="preserve">Nếu dùng ca hàm </w:t>
-      </w:r>
-      <w:r>
-        <w:t>con/validator/bất biến thay biên chương trình chính, ghi rõ đối tượng, lý do và expected độc lập.</w:t>
+        <w:t>Nếu dùng ca hàm con/validator/bất biến thay biên chương trình chính, ghi rõ đối tượng, lý do và expected độc lập.</w:t>
       </w:r>
     </w:p>
     <w:p>
@@ -16715,10 +16230,10 @@
                 <w:noProof/>
               </w:rPr>
               <w:drawing>
-                <wp:inline distT="0" distB="0" distL="0" distR="0" wp14:anchorId="7E9F457B" wp14:editId="3F3973D3">
-                  <wp:extent cx="5120640" cy="2220816"/>
+                <wp:inline distT="0" distB="0" distL="0" distR="0" wp14:anchorId="2BBB6C31" wp14:editId="50325CB5">
+                  <wp:extent cx="5120640" cy="3125474"/>
                   <wp:effectExtent l="0" t="0" r="0" b="0"/>
-                  <wp:docPr id="7" name="Picture 7"/>
+                  <wp:docPr id="18" name="Picture 18"/>
                   <wp:cNvGraphicFramePr>
                     <a:graphicFrameLocks xmlns:a="http://schemas.openxmlformats.org/drawingml/2006/main" noChangeAspect="1"/>
                   </wp:cNvGraphicFramePr>
@@ -16738,7 +16253,7 @@
                         <pic:spPr>
                           <a:xfrm>
                             <a:off x="0" y="0"/>
-                            <a:ext cx="5120640" cy="2220816"/>
+                            <a:ext cx="5120640" cy="3125474"/>
                           </a:xfrm>
                           <a:prstGeom prst="rect">
                             <a:avLst/>
@@ -16761,6 +16276,7 @@
       </w:pPr>
       <w:bookmarkStart w:id="47" w:name="_Toc243125671"/>
       <w:r>
+        <w:lastRenderedPageBreak/>
         <w:t xml:space="preserve">Hình 4.7 Biên 3 </w:t>
       </w:r>
       <w:sdt>
@@ -16890,10 +16406,10 @@
                 <w:noProof/>
               </w:rPr>
               <w:drawing>
-                <wp:inline distT="0" distB="0" distL="0" distR="0" wp14:anchorId="1A1D2E1C" wp14:editId="6C7EB472">
-                  <wp:extent cx="5120640" cy="1883865"/>
+                <wp:inline distT="0" distB="0" distL="0" distR="0" wp14:anchorId="371B5B7A" wp14:editId="2F913B5A">
+                  <wp:extent cx="5120640" cy="3125474"/>
                   <wp:effectExtent l="0" t="0" r="0" b="0"/>
-                  <wp:docPr id="8" name="Picture 8"/>
+                  <wp:docPr id="19" name="Picture 19"/>
                   <wp:cNvGraphicFramePr>
                     <a:graphicFrameLocks xmlns:a="http://schemas.openxmlformats.org/drawingml/2006/main" noChangeAspect="1"/>
                   </wp:cNvGraphicFramePr>
@@ -16913,7 +16429,7 @@
                         <pic:spPr>
                           <a:xfrm>
                             <a:off x="0" y="0"/>
-                            <a:ext cx="5120640" cy="1883865"/>
+                            <a:ext cx="5120640" cy="3125474"/>
                           </a:xfrm>
                           <a:prstGeom prst="rect">
                             <a:avLst/>
@@ -16985,7 +16501,6 @@
       </w:pPr>
       <w:bookmarkStart w:id="50" w:name="_Toc243125637"/>
       <w:r>
-        <w:lastRenderedPageBreak/>
         <w:t>4.7. Kết quả toàn bộ kiểm thử</w:t>
       </w:r>
       <w:bookmarkEnd w:id="50"/>
@@ -17018,13 +16533,7 @@
             <w:rPr>
               <w:sz w:val="24"/>
             </w:rPr>
-            <w:t xml:space="preserve">[VIẾT NỘI DUNG CỦA </w:t>
-          </w:r>
-          <w:r>
-            <w:rPr>
-              <w:sz w:val="24"/>
-            </w:rPr>
-            <w:t>SINH VIÊN TẠI ĐÂY]</w:t>
+            <w:t>[VIẾT NỘI DUNG CỦA SINH VIÊN TẠI ĐÂY]</w:t>
           </w:r>
         </w:sdtContent>
       </w:sdt>
@@ -17071,11 +16580,12 @@
               <w:rPr>
                 <w:noProof/>
               </w:rPr>
+              <w:lastRenderedPageBreak/>
               <w:drawing>
-                <wp:inline distT="0" distB="0" distL="0" distR="0" wp14:anchorId="53DD762B" wp14:editId="720B3A17">
-                  <wp:extent cx="5120640" cy="747282"/>
+                <wp:inline distT="0" distB="0" distL="0" distR="0" wp14:anchorId="719EB1FA" wp14:editId="701EAC31">
+                  <wp:extent cx="5120640" cy="3125474"/>
                   <wp:effectExtent l="0" t="0" r="0" b="0"/>
-                  <wp:docPr id="9" name="Picture 9"/>
+                  <wp:docPr id="20" name="Picture 20"/>
                   <wp:cNvGraphicFramePr>
                     <a:graphicFrameLocks xmlns:a="http://schemas.openxmlformats.org/drawingml/2006/main" noChangeAspect="1"/>
                   </wp:cNvGraphicFramePr>
@@ -17095,7 +16605,7 @@
                         <pic:spPr>
                           <a:xfrm>
                             <a:off x="0" y="0"/>
-                            <a:ext cx="5120640" cy="747282"/>
+                            <a:ext cx="5120640" cy="3125474"/>
                           </a:xfrm>
                           <a:prstGeom prst="rect">
                             <a:avLst/>
@@ -17284,13 +16794,7 @@
         <w:rPr>
           <w:sz w:val="24"/>
         </w:rPr>
-        <w:t xml:space="preserve">Chọn Q1, Q2, Q3 </w:t>
-      </w:r>
-      <w:r>
-        <w:rPr>
-          <w:sz w:val="24"/>
-        </w:rPr>
-        <w:t>trong đúng miền phiếu. Nếu được tăng quy mô, ghi rõ tham số và ba giá trị; với nhiều bản cài, tôn trọng giới hạn riêng của bản chậm. Nếu kích thước cố định hoặc miền rất hẹp, dùng ba cấu hình/độ khó/giá trị điều khiển hợp lệ và giải thích yếu tố thay đổi. Không tự mở rộng miền chỉ để có ba cỡ; không dùng ba cấu hình cùng kích thước làm chứng minh tốc độ tăng theo kích thước.</w:t>
+        <w:t>Chọn Q1, Q2, Q3 trong đúng miền phiếu. Nếu được tăng quy mô, ghi rõ tham số và ba giá trị; với nhiều bản cài, tôn trọng giới hạn riêng của bản chậm. Nếu kích thước cố định hoặc miền rất hẹp, dùng ba cấu hình/độ khó/giá trị điều khiển hợp lệ và giải thích yếu tố thay đổi. Không tự mở rộng miền chỉ để có ba cỡ; không dùng ba cấu hình cùng kích thước làm chứng minh tốc độ tăng theo kích thước.</w:t>
       </w:r>
     </w:p>
     <w:tbl>
@@ -17342,6 +16846,7 @@
                 <w:b/>
                 <w:sz w:val="22"/>
               </w:rPr>
+              <w:lastRenderedPageBreak/>
               <w:t>Bộ</w:t>
             </w:r>
           </w:p>
@@ -17451,13 +16956,7 @@
               <w:rPr>
                 <w:sz w:val="22"/>
               </w:rPr>
-              <w:t xml:space="preserve">Đã tăng: ss=9, dich=0 | Gần </w:t>
-            </w:r>
-            <w:r>
-              <w:rPr>
-                <w:sz w:val="22"/>
-              </w:rPr>
-              <w:t>tăng: ss=10, dich=1 | Giảm: ss=45, dich=45</w:t>
+              <w:t>Đã tăng: ss=9, dich=0 | Gần tăng: ss=10, dich=1 | Giảm: ss=45, dich=45</w:t>
             </w:r>
           </w:p>
         </w:tc>
@@ -17518,7 +17017,6 @@
               <w:rPr>
                 <w:sz w:val="22"/>
               </w:rPr>
-              <w:lastRenderedPageBreak/>
               <w:t>Q2 (n = 100)</w:t>
             </w:r>
           </w:p>
@@ -17704,13 +17202,7 @@
               <w:rPr>
                 <w:sz w:val="22"/>
               </w:rPr>
-              <w:t xml:space="preserve">Đã tăng: 3.57ms, Gần tăng: </w:t>
-            </w:r>
-            <w:r>
-              <w:rPr>
-                <w:sz w:val="22"/>
-              </w:rPr>
-              <w:t>9.41ms, Giảm: 11.43ms</w:t>
+              <w:t>Đã tăng: 3.57ms, Gần tăng: 9.41ms, Giảm: 11.43ms</w:t>
             </w:r>
           </w:p>
         </w:tc>
@@ -17740,13 +17232,7 @@
         <w:rPr>
           <w:sz w:val="24"/>
         </w:rPr>
-        <w:t xml:space="preserve">Định nghĩa chính xác phép toán đếm hoặc phần việc đo. Nếu đo thời gian, ghi môi trường, làm nóng, số lần chạy và cách tổng hợp; tách nhập/xuất khi </w:t>
-      </w:r>
-      <w:r>
-        <w:rPr>
-          <w:sz w:val="24"/>
-        </w:rPr>
-        <w:t>không thuộc phần đang khảo sát. Có thể đếm phép toán thay cho đo thời gian.</w:t>
+        <w:t>Định nghĩa chính xác phép toán đếm hoặc phần việc đo. Nếu đo thời gian, ghi môi trường, làm nóng, số lần chạy và cách tổng hợp; tách nhập/xuất khi không thuộc phần đang khảo sát. Có thể đếm phép toán thay cho đo thời gian.</w:t>
       </w:r>
     </w:p>
     <w:p>
@@ -18140,13 +17626,7 @@
             <w:rPr>
               <w:sz w:val="24"/>
             </w:rPr>
-            <w:t xml:space="preserve">[VIẾT </w:t>
-          </w:r>
-          <w:r>
-            <w:rPr>
-              <w:sz w:val="24"/>
-            </w:rPr>
-            <w:t>NỘI DUNG CỦA SINH VIÊN TẠI ĐÂY]</w:t>
+            <w:t>[VIẾT NỘI DUNG CỦA SINH VIÊN TẠI ĐÂY]</w:t>
           </w:r>
         </w:sdtContent>
       </w:sdt>
@@ -18217,10 +17697,10 @@
               </w:rPr>
               <w:lastRenderedPageBreak/>
               <w:drawing>
-                <wp:inline distT="0" distB="0" distL="0" distR="0" wp14:anchorId="33C088D4" wp14:editId="7C4E0C3F">
+                <wp:inline distT="0" distB="0" distL="0" distR="0" wp14:anchorId="63C0D50D" wp14:editId="77BA3A4C">
                   <wp:extent cx="5120640" cy="2880360"/>
                   <wp:effectExtent l="0" t="0" r="0" b="0"/>
-                  <wp:docPr id="10" name="Picture 10"/>
+                  <wp:docPr id="21" name="Picture 21"/>
                   <wp:cNvGraphicFramePr>
                     <a:graphicFrameLocks xmlns:a="http://schemas.openxmlformats.org/drawingml/2006/main" noChangeAspect="1"/>
                   </wp:cNvGraphicFramePr>
@@ -18228,7 +17708,7 @@
                     <a:graphicData uri="http://schemas.openxmlformats.org/drawingml/2006/picture">
                       <pic:pic xmlns:pic="http://schemas.openxmlformats.org/drawingml/2006/picture">
                         <pic:nvPicPr>
-                          <pic:cNvPr id="0" name="10_clone_sach_chay_lai.png"/>
+                          <pic:cNvPr id="0" name="image.png"/>
                           <pic:cNvPicPr/>
                         </pic:nvPicPr>
                         <pic:blipFill>
@@ -18357,10 +17837,10 @@
                 <w:noProof/>
               </w:rPr>
               <w:drawing>
-                <wp:inline distT="0" distB="0" distL="0" distR="0" wp14:anchorId="5938C7EB" wp14:editId="725A6619">
+                <wp:inline distT="0" distB="0" distL="0" distR="0" wp14:anchorId="3E5B6900" wp14:editId="53D7F459">
                   <wp:extent cx="5120640" cy="2880360"/>
                   <wp:effectExtent l="0" t="0" r="0" b="0"/>
-                  <wp:docPr id="11" name="Picture 11"/>
+                  <wp:docPr id="22" name="Picture 22"/>
                   <wp:cNvGraphicFramePr>
                     <a:graphicFrameLocks xmlns:a="http://schemas.openxmlformats.org/drawingml/2006/main" noChangeAspect="1"/>
                   </wp:cNvGraphicFramePr>
@@ -18368,7 +17848,7 @@
                     <a:graphicData uri="http://schemas.openxmlformats.org/drawingml/2006/picture">
                       <pic:pic xmlns:pic="http://schemas.openxmlformats.org/drawingml/2006/picture">
                         <pic:nvPicPr>
-                          <pic:cNvPr id="0" name="11_github_repo_commit.png"/>
+                          <pic:cNvPr id="0" name="image.png"/>
                           <pic:cNvPicPr/>
                         </pic:nvPicPr>
                         <pic:blipFill>
@@ -18474,10 +17954,7 @@
         <w:pStyle w:val="Nidung"/>
       </w:pPr>
       <w:r>
-        <w:t xml:space="preserve">Đối chiếu từng mục tiêu Chương 1 với hàm đã cài, kết quả và bằng chứng. Ghi số ca thật, ca lỗi còn lại và khả năng clone chạy </w:t>
-      </w:r>
-      <w:r>
-        <w:t>lại. Dẫn bảng/hình cụ thể, không chỉ viết đã hoàn thành tốt.</w:t>
+        <w:t>Đối chiếu từng mục tiêu Chương 1 với hàm đã cài, kết quả và bằng chứng. Ghi số ca thật, ca lỗi còn lại và khả năng clone chạy lại. Dẫn bảng/hình cụ thể, không chỉ viết đã hoàn thành tốt.</w:t>
       </w:r>
     </w:p>
     <w:p>
@@ -18767,13 +18244,7 @@
               <w:rPr>
                 <w:sz w:val="22"/>
               </w:rPr>
-              <w:t xml:space="preserve">Giới hạn mảng n &lt;= </w:t>
-            </w:r>
-            <w:r>
-              <w:rPr>
-                <w:sz w:val="22"/>
-              </w:rPr>
-              <w:t>5000 theo phiếu</w:t>
+              <w:t>Giới hạn mảng n &lt;= 5000 theo phiếu</w:t>
             </w:r>
           </w:p>
         </w:tc>
@@ -18929,13 +18400,7 @@
               <w:rPr>
                 <w:sz w:val="22"/>
               </w:rPr>
-              <w:t xml:space="preserve">11 ảnh </w:t>
-            </w:r>
-            <w:r>
-              <w:rPr>
-                <w:sz w:val="22"/>
-              </w:rPr>
-              <w:t>gốc docs/anh_ket_qua/, SHA C &amp; clone sạch</w:t>
+              <w:t>11 ảnh gốc docs/anh_ket_qua/, SHA C &amp; clone sạch</w:t>
             </w:r>
           </w:p>
         </w:tc>
@@ -19195,10 +18660,7 @@
         <w:pStyle w:val="Nidung"/>
       </w:pPr>
       <w:r>
-        <w:t xml:space="preserve">Chèn cây tệp, yêu cầu môi trường, lệnh chạy ví dụ/nhập dữ liệu/test; dẫn README và permalink. Toàn bộ mã </w:t>
-      </w:r>
-      <w:r>
-        <w:t>nằm trong repo; chỉ đưa đoạn bổ sung cần thiết vào phụ lục.</w:t>
+        <w:t>Chèn cây tệp, yêu cầu môi trường, lệnh chạy ví dụ/nhập dữ liệu/test; dẫn README và permalink. Toàn bộ mã nằm trong repo; chỉ đưa đoạn bổ sung cần thiết vào phụ lục.</w:t>
       </w:r>
     </w:p>
     <w:p>
@@ -19627,13 +19089,7 @@
               <w:rPr>
                 <w:sz w:val="22"/>
               </w:rPr>
-              <w:t xml:space="preserve">Ca biên 1: Mảng </w:t>
-            </w:r>
-            <w:r>
-              <w:rPr>
-                <w:sz w:val="22"/>
-              </w:rPr>
-              <w:t>rỗng Int[]</w:t>
+              <w:t>Ca biên 1: Mảng rỗng Int[]</w:t>
             </w:r>
           </w:p>
         </w:tc>
@@ -19774,13 +19230,7 @@
               <w:rPr>
                 <w:sz w:val="22"/>
               </w:rPr>
-              <w:t xml:space="preserve">Input sai bị </w:t>
-            </w:r>
-            <w:r>
-              <w:rPr>
-                <w:sz w:val="22"/>
-              </w:rPr>
-              <w:t>Validator từ chối</w:t>
+              <w:t>Input sai bị Validator từ chối</w:t>
             </w:r>
           </w:p>
         </w:tc>
@@ -20099,13 +19549,7 @@
         <w:rPr>
           <w:sz w:val="24"/>
         </w:rPr>
-        <w:t xml:space="preserve">. Dùng họ tên không dấu, không khoảng trắng và đúng MSSV/mã đề trong phân công. Hạn nộp và lịch bảo vệ theo thông </w:t>
-      </w:r>
-      <w:r>
-        <w:rPr>
-          <w:sz w:val="24"/>
-        </w:rPr>
-        <w:t>báo trên Classroom.</w:t>
+        <w:t>. Dùng họ tên không dấu, không khoảng trắng và đúng MSSV/mã đề trong phân công. Hạn nộp và lịch bảo vệ theo thông báo trên Classroom.</w:t>
       </w:r>
     </w:p>
     <w:p>

</xml_diff>

<commit_message>
Cap nhat bao cao khong con placeholder
</commit_message>
<xml_diff>
--- a/N24DCDT018_DT012_DoHongDuong_BaoCao.docx
+++ b/N24DCDT018_DT012_DoHongDuong_BaoCao.docx
@@ -2481,7 +2481,7 @@
         <w:jc w:val="center"/>
       </w:pPr>
       <w:r>
-        <w:t>TP. Hồ Chí Minh ngày ...... tháng ...... năm ......</w:t>
+        <w:t>TP. Hồ Chí Minh, ngày 27 tháng 10 năm 2026</w:t>
       </w:r>
       <w:r>
         <w:br/>
@@ -2496,7 +2496,7 @@
       </w:r>
       <w:r>
         <w:br/>
-        <w:t>[HỌ VÀ TÊN]</w:t>
+        <w:t>Đỗ Hồng Dương</w:t>
       </w:r>
     </w:p>
     <w:p>
@@ -7110,71 +7110,19 @@
           <w14:ligatures w14:val="standardContextual"/>
         </w:rPr>
       </w:pPr>
-      <w:hyperlink w:anchor="_Toc243125656" w:history="1">
-        <w:r>
-          <w:rPr>
-            <w:rStyle w:val="Hyperlink"/>
-            <w:noProof/>
-            <w:sz w:val="24"/>
-          </w:rPr>
-          <w:t>Bảng 3.3 Truy vết ca [MÃ CA TRUY VẾT]</w:t>
-        </w:r>
-        <w:r>
-          <w:rPr>
-            <w:noProof/>
-            <w:webHidden/>
-            <w:sz w:val="24"/>
-          </w:rPr>
-          <w:tab/>
-        </w:r>
-        <w:r>
-          <w:rPr>
-            <w:noProof/>
-            <w:webHidden/>
-            <w:sz w:val="24"/>
-          </w:rPr>
-          <w:fldChar w:fldCharType="begin"/>
-        </w:r>
-        <w:r>
-          <w:rPr>
-            <w:noProof/>
-            <w:webHidden/>
-            <w:sz w:val="24"/>
-          </w:rPr>
-          <w:instrText xml:space="preserve"> PAGEREF _Toc243125656 \h </w:instrText>
-        </w:r>
-        <w:r>
-          <w:rPr>
-            <w:noProof/>
-            <w:webHidden/>
-            <w:sz w:val="24"/>
-          </w:rPr>
-        </w:r>
-        <w:r>
-          <w:rPr>
-            <w:noProof/>
-            <w:webHidden/>
-            <w:sz w:val="24"/>
-          </w:rPr>
-          <w:fldChar w:fldCharType="separate"/>
-        </w:r>
-        <w:r>
-          <w:rPr>
-            <w:noProof/>
-            <w:webHidden/>
-            <w:sz w:val="24"/>
-          </w:rPr>
-          <w:t>7</w:t>
-        </w:r>
-        <w:r>
-          <w:rPr>
-            <w:noProof/>
-            <w:webHidden/>
-            <w:sz w:val="24"/>
-          </w:rPr>
-          <w:fldChar w:fldCharType="end"/>
-        </w:r>
-      </w:hyperlink>
+      <w:r>
+        <w:rPr>
+          <w:noProof/>
+        </w:rPr>
+        <w:t>Bảng 3.3 Truy vết ca TC01 [4, 1, 3, 2]</w:t>
+      </w:r>
+      <w:r>
+        <w:rPr>
+          <w:noProof/>
+        </w:rPr>
+        <w:tab/>
+        <w:t>7</w:t>
+      </w:r>
     </w:p>
     <w:p>
       <w:pPr>
@@ -11297,25 +11245,9 @@
         <w:pStyle w:val="Chthchbng"/>
         <w:spacing w:before="80" w:after="100" w:line="269" w:lineRule="auto"/>
       </w:pPr>
-      <w:bookmarkStart w:id="28" w:name="_Toc243125656"/>
       <w:r>
-        <w:t xml:space="preserve">Bảng 3.3 Truy vết ca </w:t>
+        <w:t>Bảng 3.3 Truy vết ca TC01 [4, 1, 3, 2]</w:t>
       </w:r>
-      <w:sdt>
-        <w:sdtPr>
-          <w:alias w:val="MÃ CA TRUY VẾT"/>
-          <w:tag w:val="SV_0120"/>
-          <w:id w:val="700120"/>
-          <w:text w:multiLine="1"/>
-        </w:sdtPr>
-        <w:sdtEndPr/>
-        <w:sdtContent>
-          <w:r>
-            <w:t>[MÃ CA TRUY VẾT]</w:t>
-          </w:r>
-        </w:sdtContent>
-      </w:sdt>
-      <w:bookmarkEnd w:id="28"/>
     </w:p>
     <w:tbl>
       <w:tblPr>
@@ -11777,11 +11709,11 @@
       <w:pPr>
         <w:pStyle w:val="Heading2"/>
       </w:pPr>
-      <w:bookmarkStart w:id="29" w:name="_Toc243125628"/>
+      <w:bookmarkStart w:id="28" w:name="_Toc243125628"/>
       <w:r>
         <w:t>3.5. Giải thích tính đúng và điều kiện dừng</w:t>
       </w:r>
-      <w:bookmarkEnd w:id="29"/>
+      <w:bookmarkEnd w:id="28"/>
     </w:p>
     <w:p>
       <w:pPr>
@@ -11869,11 +11801,11 @@
       <w:pPr>
         <w:pStyle w:val="Heading2"/>
       </w:pPr>
-      <w:bookmarkStart w:id="30" w:name="_Toc243125629"/>
+      <w:bookmarkStart w:id="29" w:name="_Toc243125629"/>
       <w:r>
         <w:t>3.6. Phân tích độ phức tạp</w:t>
       </w:r>
-      <w:bookmarkEnd w:id="30"/>
+      <w:bookmarkEnd w:id="29"/>
     </w:p>
     <w:p>
       <w:pPr>
@@ -11922,11 +11854,11 @@
         <w:spacing w:before="0" w:after="100" w:line="269" w:lineRule="auto"/>
         <w:jc w:val="left"/>
       </w:pPr>
-      <w:bookmarkStart w:id="31" w:name="_Toc243125657"/>
+      <w:bookmarkStart w:id="30" w:name="_Toc243125657"/>
       <w:r>
         <w:t>Bảng 3.4 Chi phí của từng pha trong bản cài</w:t>
       </w:r>
-      <w:bookmarkEnd w:id="31"/>
+      <w:bookmarkEnd w:id="30"/>
     </w:p>
     <w:tbl>
       <w:tblPr>
@@ -12453,22 +12385,22 @@
         <w:keepNext w:val="0"/>
         <w:spacing w:before="0" w:after="320"/>
       </w:pPr>
-      <w:bookmarkStart w:id="32" w:name="_Toc243125630"/>
+      <w:bookmarkStart w:id="31" w:name="_Toc243125630"/>
       <w:r>
         <w:lastRenderedPageBreak/>
         <w:t>CHƯƠNG 4. KẾT QUẢ THỬ NGHIỆM VÀ NHẬN XÉT</w:t>
       </w:r>
-      <w:bookmarkEnd w:id="32"/>
+      <w:bookmarkEnd w:id="31"/>
     </w:p>
     <w:p>
       <w:pPr>
         <w:pStyle w:val="Heading2"/>
       </w:pPr>
-      <w:bookmarkStart w:id="33" w:name="_Toc243125631"/>
+      <w:bookmarkStart w:id="32" w:name="_Toc243125631"/>
       <w:r>
         <w:t>4.1. Môi trường và kế hoạch kiểm thử</w:t>
       </w:r>
-      <w:bookmarkEnd w:id="33"/>
+      <w:bookmarkEnd w:id="32"/>
     </w:p>
     <w:p>
       <w:pPr>
@@ -12556,11 +12488,11 @@
       <w:pPr>
         <w:pStyle w:val="Heading2"/>
       </w:pPr>
-      <w:bookmarkStart w:id="34" w:name="_Toc243125632"/>
+      <w:bookmarkStart w:id="33" w:name="_Toc243125632"/>
       <w:r>
         <w:t>4.2. Bảng kết quả ít nhất 12 ca</w:t>
       </w:r>
-      <w:bookmarkEnd w:id="34"/>
+      <w:bookmarkEnd w:id="33"/>
     </w:p>
     <w:p>
       <w:pPr>
@@ -12634,11 +12566,11 @@
         <w:spacing w:before="0" w:after="100" w:line="269" w:lineRule="auto"/>
         <w:jc w:val="left"/>
       </w:pPr>
-      <w:bookmarkStart w:id="35" w:name="_Toc243125658"/>
+      <w:bookmarkStart w:id="34" w:name="_Toc243125658"/>
       <w:r>
         <w:t>Bảng 4.1 Ánh xạ năm ca kiểm trên phiếu</w:t>
       </w:r>
-      <w:bookmarkEnd w:id="35"/>
+      <w:bookmarkEnd w:id="34"/>
     </w:p>
     <w:p>
       <w:pPr>
@@ -13089,11 +13021,11 @@
         <w:pStyle w:val="Chthchbng"/>
         <w:spacing w:before="80" w:after="100" w:line="269" w:lineRule="auto"/>
       </w:pPr>
-      <w:bookmarkStart w:id="36" w:name="_Toc243125659"/>
+      <w:bookmarkStart w:id="35" w:name="_Toc243125659"/>
       <w:r>
         <w:t>Bảng 4.2 Thiết kế ít nhất 12 ca kiểm độc lập</w:t>
       </w:r>
-      <w:bookmarkEnd w:id="36"/>
+      <w:bookmarkEnd w:id="35"/>
     </w:p>
     <w:tbl>
       <w:tblPr>
@@ -13952,12 +13884,12 @@
         <w:pageBreakBefore/>
         <w:spacing w:before="80" w:after="100" w:line="269" w:lineRule="auto"/>
       </w:pPr>
-      <w:bookmarkStart w:id="37" w:name="_Toc243125660"/>
+      <w:bookmarkStart w:id="36" w:name="_Toc243125660"/>
       <w:r>
         <w:lastRenderedPageBreak/>
         <w:t>Bảng 4.3 Actual kết luận và vị trí minh chứng</w:t>
       </w:r>
-      <w:bookmarkEnd w:id="37"/>
+      <w:bookmarkEnd w:id="36"/>
     </w:p>
     <w:tbl>
       <w:tblPr>
@@ -14818,12 +14750,12 @@
         <w:ind w:firstLine="0"/>
         <w:jc w:val="center"/>
       </w:pPr>
-      <w:bookmarkStart w:id="38" w:name="_Toc243125633"/>
+      <w:bookmarkStart w:id="37" w:name="_Toc243125633"/>
       <w:r>
         <w:lastRenderedPageBreak/>
         <w:t>4.3. Hai ví dụ trên phiếu</w:t>
       </w:r>
-      <w:bookmarkEnd w:id="38"/>
+      <w:bookmarkEnd w:id="37"/>
     </w:p>
     <w:p>
       <w:pPr>
@@ -15038,7 +14970,7 @@
         <w:pStyle w:val="Chthchhnh"/>
         <w:spacing w:before="80" w:after="100" w:line="269" w:lineRule="auto"/>
       </w:pPr>
-      <w:bookmarkStart w:id="39" w:name="_Toc243125665"/>
+      <w:bookmarkStart w:id="38" w:name="_Toc243125665"/>
       <w:r>
         <w:t xml:space="preserve">Hình 4.1 Ví dụ 1 </w:t>
       </w:r>
@@ -15056,7 +14988,7 @@
           </w:r>
         </w:sdtContent>
       </w:sdt>
-      <w:bookmarkEnd w:id="39"/>
+      <w:bookmarkEnd w:id="38"/>
     </w:p>
     <w:p>
       <w:pPr>
@@ -15311,7 +15243,7 @@
         <w:pStyle w:val="Chthchhnh"/>
         <w:spacing w:before="80" w:after="100" w:line="269" w:lineRule="auto"/>
       </w:pPr>
-      <w:bookmarkStart w:id="40" w:name="_Toc243125666"/>
+      <w:bookmarkStart w:id="39" w:name="_Toc243125666"/>
       <w:r>
         <w:t xml:space="preserve">Hình 4.2 Ví dụ 2 </w:t>
       </w:r>
@@ -15329,7 +15261,7 @@
           </w:r>
         </w:sdtContent>
       </w:sdt>
-      <w:bookmarkEnd w:id="40"/>
+      <w:bookmarkEnd w:id="39"/>
     </w:p>
     <w:p>
       <w:pPr>
@@ -15364,12 +15296,12 @@
         <w:ind w:firstLine="0"/>
         <w:jc w:val="center"/>
       </w:pPr>
-      <w:bookmarkStart w:id="41" w:name="_Toc243125634"/>
+      <w:bookmarkStart w:id="40" w:name="_Toc243125634"/>
       <w:r>
         <w:lastRenderedPageBreak/>
         <w:t>4.4. Hai ca sinh viên tự thiết kế</w:t>
       </w:r>
-      <w:bookmarkEnd w:id="41"/>
+      <w:bookmarkEnd w:id="40"/>
     </w:p>
     <w:p>
       <w:pPr>
@@ -15499,7 +15431,7 @@
         <w:pStyle w:val="Chthchhnh"/>
         <w:spacing w:before="80" w:after="100" w:line="269" w:lineRule="auto"/>
       </w:pPr>
-      <w:bookmarkStart w:id="42" w:name="_Toc243125667"/>
+      <w:bookmarkStart w:id="41" w:name="_Toc243125667"/>
       <w:r>
         <w:t xml:space="preserve">Hình 4.3 Ca tự thiết kế 1 </w:t>
       </w:r>
@@ -15517,7 +15449,7 @@
           </w:r>
         </w:sdtContent>
       </w:sdt>
-      <w:bookmarkEnd w:id="42"/>
+      <w:bookmarkEnd w:id="41"/>
     </w:p>
     <w:p>
       <w:pPr>
@@ -15673,7 +15605,7 @@
         <w:pStyle w:val="Chthchhnh"/>
         <w:spacing w:before="80" w:after="100" w:line="269" w:lineRule="auto"/>
       </w:pPr>
-      <w:bookmarkStart w:id="43" w:name="_Toc243125668"/>
+      <w:bookmarkStart w:id="42" w:name="_Toc243125668"/>
       <w:r>
         <w:t xml:space="preserve">Hình 4.4 Ca tự thiết kế 2 </w:t>
       </w:r>
@@ -15691,7 +15623,7 @@
           </w:r>
         </w:sdtContent>
       </w:sdt>
-      <w:bookmarkEnd w:id="43"/>
+      <w:bookmarkEnd w:id="42"/>
     </w:p>
     <w:p>
       <w:pPr>
@@ -15726,12 +15658,12 @@
         <w:ind w:firstLine="0"/>
         <w:jc w:val="center"/>
       </w:pPr>
-      <w:bookmarkStart w:id="44" w:name="_Toc243125635"/>
+      <w:bookmarkStart w:id="43" w:name="_Toc243125635"/>
       <w:r>
         <w:lastRenderedPageBreak/>
         <w:t>4.5. Ba ca biên phù hợp với đề tài</w:t>
       </w:r>
-      <w:bookmarkEnd w:id="44"/>
+      <w:bookmarkEnd w:id="43"/>
     </w:p>
     <w:p>
       <w:pPr>
@@ -15894,7 +15826,7 @@
         <w:pStyle w:val="Chthchhnh"/>
         <w:spacing w:before="80" w:after="100" w:line="269" w:lineRule="auto"/>
       </w:pPr>
-      <w:bookmarkStart w:id="45" w:name="_Toc243125669"/>
+      <w:bookmarkStart w:id="44" w:name="_Toc243125669"/>
       <w:r>
         <w:t xml:space="preserve">Hình 4.5 Biên 1 </w:t>
       </w:r>
@@ -15912,7 +15844,7 @@
           </w:r>
         </w:sdtContent>
       </w:sdt>
-      <w:bookmarkEnd w:id="45"/>
+      <w:bookmarkEnd w:id="44"/>
     </w:p>
     <w:p>
       <w:pPr>
@@ -16068,7 +16000,7 @@
         <w:pStyle w:val="Chthchhnh"/>
         <w:spacing w:before="80" w:after="100" w:line="269" w:lineRule="auto"/>
       </w:pPr>
-      <w:bookmarkStart w:id="46" w:name="_Toc243125670"/>
+      <w:bookmarkStart w:id="45" w:name="_Toc243125670"/>
       <w:r>
         <w:t xml:space="preserve">Hình 4.6 Biên 2 </w:t>
       </w:r>
@@ -16086,7 +16018,7 @@
           </w:r>
         </w:sdtContent>
       </w:sdt>
-      <w:bookmarkEnd w:id="46"/>
+      <w:bookmarkEnd w:id="45"/>
     </w:p>
     <w:p>
       <w:pPr>
@@ -16274,7 +16206,7 @@
         <w:pStyle w:val="Chthchhnh"/>
         <w:spacing w:before="80" w:after="100" w:line="269" w:lineRule="auto"/>
       </w:pPr>
-      <w:bookmarkStart w:id="47" w:name="_Toc243125671"/>
+      <w:bookmarkStart w:id="46" w:name="_Toc243125671"/>
       <w:r>
         <w:lastRenderedPageBreak/>
         <w:t xml:space="preserve">Hình 4.7 Biên 3 </w:t>
@@ -16293,7 +16225,7 @@
           </w:r>
         </w:sdtContent>
       </w:sdt>
-      <w:bookmarkEnd w:id="47"/>
+      <w:bookmarkEnd w:id="46"/>
     </w:p>
     <w:p>
       <w:pPr>
@@ -16324,11 +16256,11 @@
       <w:pPr>
         <w:pStyle w:val="Heading2"/>
       </w:pPr>
-      <w:bookmarkStart w:id="48" w:name="_Toc243125636"/>
+      <w:bookmarkStart w:id="47" w:name="_Toc243125636"/>
       <w:r>
         <w:t>4.6. Kiểm tra input không hợp lệ — LOI01</w:t>
       </w:r>
-      <w:bookmarkEnd w:id="48"/>
+      <w:bookmarkEnd w:id="47"/>
     </w:p>
     <w:p>
       <w:pPr>
@@ -16450,7 +16382,7 @@
         <w:pStyle w:val="Chthchhnh"/>
         <w:spacing w:before="80" w:after="100" w:line="269" w:lineRule="auto"/>
       </w:pPr>
-      <w:bookmarkStart w:id="49" w:name="_Toc243125672"/>
+      <w:bookmarkStart w:id="48" w:name="_Toc243125672"/>
       <w:r>
         <w:t xml:space="preserve">Hình 4.8 Input không hợp lệ </w:t>
       </w:r>
@@ -16468,7 +16400,7 @@
           </w:r>
         </w:sdtContent>
       </w:sdt>
-      <w:bookmarkEnd w:id="49"/>
+      <w:bookmarkEnd w:id="48"/>
     </w:p>
     <w:p>
       <w:pPr>
@@ -16499,11 +16431,11 @@
       <w:pPr>
         <w:pStyle w:val="Heading2"/>
       </w:pPr>
-      <w:bookmarkStart w:id="50" w:name="_Toc243125637"/>
+      <w:bookmarkStart w:id="49" w:name="_Toc243125637"/>
       <w:r>
         <w:t>4.7. Kết quả toàn bộ kiểm thử</w:t>
       </w:r>
-      <w:bookmarkEnd w:id="50"/>
+      <w:bookmarkEnd w:id="49"/>
     </w:p>
     <w:p>
       <w:pPr>
@@ -16626,7 +16558,7 @@
         <w:pStyle w:val="Chthchhnh"/>
         <w:spacing w:before="80" w:after="100" w:line="269" w:lineRule="auto"/>
       </w:pPr>
-      <w:bookmarkStart w:id="51" w:name="_Toc243125673"/>
+      <w:bookmarkStart w:id="50" w:name="_Toc243125673"/>
       <w:r>
         <w:t xml:space="preserve">Hình 4.9 Tổng kết kiểm thử </w:t>
       </w:r>
@@ -16644,7 +16576,7 @@
           </w:r>
         </w:sdtContent>
       </w:sdt>
-      <w:bookmarkEnd w:id="51"/>
+      <w:bookmarkEnd w:id="50"/>
     </w:p>
     <w:p>
       <w:pPr>
@@ -16675,11 +16607,11 @@
       <w:pPr>
         <w:pStyle w:val="Heading2"/>
       </w:pPr>
-      <w:bookmarkStart w:id="52" w:name="_Toc243125638"/>
+      <w:bookmarkStart w:id="51" w:name="_Toc243125638"/>
       <w:r>
         <w:t>4.8. Khảo sát ba quy mô hoặc ba cấu hình hợp lệ</w:t>
       </w:r>
-      <w:bookmarkEnd w:id="52"/>
+      <w:bookmarkEnd w:id="51"/>
     </w:p>
     <w:p>
       <w:pPr>
@@ -16777,11 +16709,11 @@
         <w:spacing w:before="0" w:after="100" w:line="269" w:lineRule="auto"/>
         <w:jc w:val="left"/>
       </w:pPr>
-      <w:bookmarkStart w:id="53" w:name="_Toc243125661"/>
+      <w:bookmarkStart w:id="52" w:name="_Toc243125661"/>
       <w:r>
         <w:t>Bảng 4.4 Khảo sát Q1 Q2 Q3</w:t>
       </w:r>
-      <w:bookmarkEnd w:id="53"/>
+      <w:bookmarkEnd w:id="52"/>
     </w:p>
     <w:p>
       <w:pPr>
@@ -17257,12 +17189,12 @@
         <w:ind w:firstLine="0"/>
         <w:jc w:val="center"/>
       </w:pPr>
-      <w:bookmarkStart w:id="54" w:name="_Toc243125639"/>
+      <w:bookmarkStart w:id="53" w:name="_Toc243125639"/>
       <w:r>
         <w:lastRenderedPageBreak/>
         <w:t>4.9. GitHub và chạy lại từ bản clone sạch</w:t>
       </w:r>
-      <w:bookmarkEnd w:id="54"/>
+      <w:bookmarkEnd w:id="53"/>
     </w:p>
     <w:p>
       <w:pPr>
@@ -17310,11 +17242,11 @@
         <w:pStyle w:val="Chthchbng"/>
         <w:spacing w:before="80" w:after="100" w:line="269" w:lineRule="auto"/>
       </w:pPr>
-      <w:bookmarkStart w:id="55" w:name="_Toc243125662"/>
+      <w:bookmarkStart w:id="54" w:name="_Toc243125662"/>
       <w:r>
         <w:t>Bảng 4.5 Kho mã và phiên bản có thể kiểm lại</w:t>
       </w:r>
-      <w:bookmarkEnd w:id="55"/>
+      <w:bookmarkEnd w:id="54"/>
     </w:p>
     <w:tbl>
       <w:tblPr>
@@ -17741,7 +17673,7 @@
         <w:pStyle w:val="Chthchhnh"/>
         <w:spacing w:before="80" w:after="100" w:line="269" w:lineRule="auto"/>
       </w:pPr>
-      <w:bookmarkStart w:id="56" w:name="_Toc243125674"/>
+      <w:bookmarkStart w:id="55" w:name="_Toc243125674"/>
       <w:r>
         <w:t xml:space="preserve">Hình 4.10 Clone sạch và chạy lại </w:t>
       </w:r>
@@ -17759,7 +17691,7 @@
           </w:r>
         </w:sdtContent>
       </w:sdt>
-      <w:bookmarkEnd w:id="56"/>
+      <w:bookmarkEnd w:id="55"/>
     </w:p>
     <w:p>
       <w:pPr>
@@ -17881,7 +17813,7 @@
         <w:pStyle w:val="Chthchhnh"/>
         <w:spacing w:before="80" w:after="100" w:line="269" w:lineRule="auto"/>
       </w:pPr>
-      <w:bookmarkStart w:id="57" w:name="_Toc243125675"/>
+      <w:bookmarkStart w:id="56" w:name="_Toc243125675"/>
       <w:r>
         <w:t xml:space="preserve">Hình 4.11 GitHub repo và commit </w:t>
       </w:r>
@@ -17899,7 +17831,7 @@
           </w:r>
         </w:sdtContent>
       </w:sdt>
-      <w:bookmarkEnd w:id="57"/>
+      <w:bookmarkEnd w:id="56"/>
     </w:p>
     <w:p>
       <w:pPr>
@@ -17932,22 +17864,22 @@
         <w:keepNext w:val="0"/>
         <w:spacing w:before="0" w:after="320"/>
       </w:pPr>
-      <w:bookmarkStart w:id="58" w:name="_Toc243125640"/>
+      <w:bookmarkStart w:id="57" w:name="_Toc243125640"/>
       <w:r>
         <w:lastRenderedPageBreak/>
         <w:t>CHƯƠNG 5. KẾT LUẬN VÀ HƯỚNG PHÁT TRIỂN</w:t>
       </w:r>
-      <w:bookmarkEnd w:id="58"/>
+      <w:bookmarkEnd w:id="57"/>
     </w:p>
     <w:p>
       <w:pPr>
         <w:pStyle w:val="Heading2"/>
       </w:pPr>
-      <w:bookmarkStart w:id="59" w:name="_Toc243125641"/>
+      <w:bookmarkStart w:id="58" w:name="_Toc243125641"/>
       <w:r>
         <w:t>5.1. Mức hoàn thành so với phiếu</w:t>
       </w:r>
-      <w:bookmarkEnd w:id="59"/>
+      <w:bookmarkEnd w:id="58"/>
     </w:p>
     <w:p>
       <w:pPr>
@@ -17986,11 +17918,11 @@
       <w:pPr>
         <w:pStyle w:val="Heading2"/>
       </w:pPr>
-      <w:bookmarkStart w:id="60" w:name="_Toc243125642"/>
+      <w:bookmarkStart w:id="59" w:name="_Toc243125642"/>
       <w:r>
         <w:t>5.2. Giới hạn và bài học</w:t>
       </w:r>
-      <w:bookmarkEnd w:id="60"/>
+      <w:bookmarkEnd w:id="59"/>
     </w:p>
     <w:p>
       <w:pPr>
@@ -18029,11 +17961,11 @@
       <w:pPr>
         <w:pStyle w:val="Heading2"/>
       </w:pPr>
-      <w:bookmarkStart w:id="61" w:name="_Toc243125643"/>
+      <w:bookmarkStart w:id="60" w:name="_Toc243125643"/>
       <w:r>
         <w:t>5.3. Hướng phát triển phù hợp</w:t>
       </w:r>
-      <w:bookmarkEnd w:id="61"/>
+      <w:bookmarkEnd w:id="60"/>
     </w:p>
     <w:p>
       <w:pPr>
@@ -18073,11 +18005,11 @@
         <w:pStyle w:val="Chthchbng"/>
         <w:spacing w:before="80" w:after="100" w:line="269" w:lineRule="auto"/>
       </w:pPr>
-      <w:bookmarkStart w:id="62" w:name="_Toc243125663"/>
+      <w:bookmarkStart w:id="61" w:name="_Toc243125663"/>
       <w:r>
         <w:t>Bảng 5.1 Mức hoàn thành và bằng chứng theo yêu cầu</w:t>
       </w:r>
-      <w:bookmarkEnd w:id="62"/>
+      <w:bookmarkEnd w:id="61"/>
     </w:p>
     <w:tbl>
       <w:tblPr>
@@ -18433,12 +18365,12 @@
         <w:keepNext w:val="0"/>
         <w:spacing w:before="0" w:after="320"/>
       </w:pPr>
-      <w:bookmarkStart w:id="63" w:name="_Toc243125644"/>
+      <w:bookmarkStart w:id="62" w:name="_Toc243125644"/>
       <w:r>
         <w:lastRenderedPageBreak/>
         <w:t>TÀI LIỆU THAM KHẢO</w:t>
       </w:r>
-      <w:bookmarkEnd w:id="63"/>
+      <w:bookmarkEnd w:id="62"/>
     </w:p>
     <w:p>
       <w:pPr>
@@ -18638,22 +18570,22 @@
         <w:keepNext w:val="0"/>
         <w:spacing w:before="0" w:after="320"/>
       </w:pPr>
-      <w:bookmarkStart w:id="64" w:name="_Toc243125645"/>
+      <w:bookmarkStart w:id="63" w:name="_Toc243125645"/>
       <w:r>
         <w:lastRenderedPageBreak/>
         <w:t>PHỤ LỤC</w:t>
       </w:r>
-      <w:bookmarkEnd w:id="64"/>
+      <w:bookmarkEnd w:id="63"/>
     </w:p>
     <w:p>
       <w:pPr>
         <w:pStyle w:val="Heading2"/>
       </w:pPr>
-      <w:bookmarkStart w:id="65" w:name="_Toc243125646"/>
+      <w:bookmarkStart w:id="64" w:name="_Toc243125646"/>
       <w:r>
         <w:t>PHỤ LỤC A. Tổ chức mã và hướng dẫn chạy</w:t>
       </w:r>
-      <w:bookmarkEnd w:id="65"/>
+      <w:bookmarkEnd w:id="64"/>
     </w:p>
     <w:p>
       <w:pPr>
@@ -18768,12 +18700,12 @@
         <w:pStyle w:val="Heading2"/>
         <w:pageBreakBefore/>
       </w:pPr>
-      <w:bookmarkStart w:id="66" w:name="_Toc243125647"/>
+      <w:bookmarkStart w:id="65" w:name="_Toc243125647"/>
       <w:r>
         <w:lastRenderedPageBreak/>
         <w:t>PHỤ LỤC B. Danh mục bằng chứng</w:t>
       </w:r>
-      <w:bookmarkEnd w:id="66"/>
+      <w:bookmarkEnd w:id="65"/>
     </w:p>
     <w:p>
       <w:pPr>
@@ -19404,12 +19336,12 @@
         <w:pStyle w:val="Heading2"/>
         <w:pageBreakBefore/>
       </w:pPr>
-      <w:bookmarkStart w:id="67" w:name="_Toc243125648"/>
+      <w:bookmarkStart w:id="66" w:name="_Toc243125648"/>
       <w:r>
         <w:lastRenderedPageBreak/>
         <w:t>PHỤ LỤC C. Tự kiểm trước khi nộp</w:t>
       </w:r>
-      <w:bookmarkEnd w:id="67"/>
+      <w:bookmarkEnd w:id="66"/>
     </w:p>
     <w:p>
       <w:pPr>
@@ -19508,12 +19440,12 @@
         <w:pStyle w:val="Heading2"/>
         <w:pageBreakBefore/>
       </w:pPr>
-      <w:bookmarkStart w:id="68" w:name="_Toc243125649"/>
+      <w:bookmarkStart w:id="67" w:name="_Toc243125649"/>
       <w:r>
         <w:lastRenderedPageBreak/>
         <w:t>PHỤ LỤC D HƯỚNG DẪN NỘP CLASSROOM</w:t>
       </w:r>
-      <w:bookmarkEnd w:id="68"/>
+      <w:bookmarkEnd w:id="67"/>
     </w:p>
     <w:p>
       <w:pPr>
@@ -19558,11 +19490,11 @@
         <w:spacing w:before="0" w:after="100" w:line="269" w:lineRule="auto"/>
         <w:jc w:val="left"/>
       </w:pPr>
-      <w:bookmarkStart w:id="69" w:name="_Toc243125664"/>
+      <w:bookmarkStart w:id="68" w:name="_Toc243125664"/>
       <w:r>
         <w:t>Bảng PL.1 Bốn tệp cần nộp</w:t>
       </w:r>
-      <w:bookmarkEnd w:id="69"/>
+      <w:bookmarkEnd w:id="68"/>
     </w:p>
     <w:tbl>
       <w:tblPr>

</xml_diff>

<commit_message>
Dung anh nguyen ban full man hinh VS Code
</commit_message>
<xml_diff>
--- a/N24DCDT018_DT012_DoHongDuong_BaoCao.docx
+++ b/N24DCDT018_DT012_DoHongDuong_BaoCao.docx
@@ -14926,10 +14926,10 @@
                 <w:noProof/>
               </w:rPr>
               <w:drawing>
-                <wp:inline distT="0" distB="0" distL="0" distR="0" wp14:anchorId="57CAA233" wp14:editId="13BD5286">
-                  <wp:extent cx="5120640" cy="3125474"/>
+                <wp:inline distT="0" distB="0" distL="0" distR="0" wp14:anchorId="6D9577EA" wp14:editId="1A26368F">
+                  <wp:extent cx="5486400" cy="3086100"/>
                   <wp:effectExtent l="0" t="0" r="0" b="0"/>
-                  <wp:docPr id="12" name="Picture 12"/>
+                  <wp:docPr id="23" name="Picture 23"/>
                   <wp:cNvGraphicFramePr>
                     <a:graphicFrameLocks xmlns:a="http://schemas.openxmlformats.org/drawingml/2006/main" noChangeAspect="1"/>
                   </wp:cNvGraphicFramePr>
@@ -14949,7 +14949,7 @@
                         <pic:spPr>
                           <a:xfrm>
                             <a:off x="0" y="0"/>
-                            <a:ext cx="5120640" cy="3125474"/>
+                            <a:ext cx="5486400" cy="3086100"/>
                           </a:xfrm>
                           <a:prstGeom prst="rect">
                             <a:avLst/>
@@ -15199,10 +15199,10 @@
               </w:rPr>
               <w:lastRenderedPageBreak/>
               <w:drawing>
-                <wp:inline distT="0" distB="0" distL="0" distR="0" wp14:anchorId="6113A9E8" wp14:editId="4A6A1135">
-                  <wp:extent cx="5120640" cy="3125474"/>
+                <wp:inline distT="0" distB="0" distL="0" distR="0" wp14:anchorId="4707CAD0" wp14:editId="10FC769D">
+                  <wp:extent cx="5486400" cy="3086100"/>
                   <wp:effectExtent l="0" t="0" r="0" b="0"/>
-                  <wp:docPr id="13" name="Picture 13"/>
+                  <wp:docPr id="24" name="Picture 24"/>
                   <wp:cNvGraphicFramePr>
                     <a:graphicFrameLocks xmlns:a="http://schemas.openxmlformats.org/drawingml/2006/main" noChangeAspect="1"/>
                   </wp:cNvGraphicFramePr>
@@ -15222,7 +15222,7 @@
                         <pic:spPr>
                           <a:xfrm>
                             <a:off x="0" y="0"/>
-                            <a:ext cx="5120640" cy="3125474"/>
+                            <a:ext cx="5486400" cy="3086100"/>
                           </a:xfrm>
                           <a:prstGeom prst="rect">
                             <a:avLst/>
@@ -15387,10 +15387,10 @@
                 <w:noProof/>
               </w:rPr>
               <w:drawing>
-                <wp:inline distT="0" distB="0" distL="0" distR="0" wp14:anchorId="6222F59E" wp14:editId="7235A6A8">
-                  <wp:extent cx="5120640" cy="3125474"/>
+                <wp:inline distT="0" distB="0" distL="0" distR="0" wp14:anchorId="405F31D6" wp14:editId="1F07BF8D">
+                  <wp:extent cx="5486400" cy="3086100"/>
                   <wp:effectExtent l="0" t="0" r="0" b="0"/>
-                  <wp:docPr id="14" name="Picture 14"/>
+                  <wp:docPr id="25" name="Picture 25"/>
                   <wp:cNvGraphicFramePr>
                     <a:graphicFrameLocks xmlns:a="http://schemas.openxmlformats.org/drawingml/2006/main" noChangeAspect="1"/>
                   </wp:cNvGraphicFramePr>
@@ -15410,7 +15410,7 @@
                         <pic:spPr>
                           <a:xfrm>
                             <a:off x="0" y="0"/>
-                            <a:ext cx="5120640" cy="3125474"/>
+                            <a:ext cx="5486400" cy="3086100"/>
                           </a:xfrm>
                           <a:prstGeom prst="rect">
                             <a:avLst/>
@@ -15561,10 +15561,10 @@
               </w:rPr>
               <w:lastRenderedPageBreak/>
               <w:drawing>
-                <wp:inline distT="0" distB="0" distL="0" distR="0" wp14:anchorId="0F476954" wp14:editId="41A07D61">
-                  <wp:extent cx="5120640" cy="3125474"/>
+                <wp:inline distT="0" distB="0" distL="0" distR="0" wp14:anchorId="074C51C7" wp14:editId="15E9F2B2">
+                  <wp:extent cx="5486400" cy="3086100"/>
                   <wp:effectExtent l="0" t="0" r="0" b="0"/>
-                  <wp:docPr id="15" name="Picture 15"/>
+                  <wp:docPr id="26" name="Picture 26"/>
                   <wp:cNvGraphicFramePr>
                     <a:graphicFrameLocks xmlns:a="http://schemas.openxmlformats.org/drawingml/2006/main" noChangeAspect="1"/>
                   </wp:cNvGraphicFramePr>
@@ -15584,7 +15584,7 @@
                         <pic:spPr>
                           <a:xfrm>
                             <a:off x="0" y="0"/>
-                            <a:ext cx="5120640" cy="3125474"/>
+                            <a:ext cx="5486400" cy="3086100"/>
                           </a:xfrm>
                           <a:prstGeom prst="rect">
                             <a:avLst/>
@@ -15782,10 +15782,10 @@
                 <w:noProof/>
               </w:rPr>
               <w:drawing>
-                <wp:inline distT="0" distB="0" distL="0" distR="0" wp14:anchorId="44F6BF1D" wp14:editId="490EA350">
-                  <wp:extent cx="5120640" cy="3125474"/>
+                <wp:inline distT="0" distB="0" distL="0" distR="0" wp14:anchorId="4B10615E" wp14:editId="4E7430A9">
+                  <wp:extent cx="5486400" cy="3086100"/>
                   <wp:effectExtent l="0" t="0" r="0" b="0"/>
-                  <wp:docPr id="16" name="Picture 16"/>
+                  <wp:docPr id="27" name="Picture 27"/>
                   <wp:cNvGraphicFramePr>
                     <a:graphicFrameLocks xmlns:a="http://schemas.openxmlformats.org/drawingml/2006/main" noChangeAspect="1"/>
                   </wp:cNvGraphicFramePr>
@@ -15805,7 +15805,7 @@
                         <pic:spPr>
                           <a:xfrm>
                             <a:off x="0" y="0"/>
-                            <a:ext cx="5120640" cy="3125474"/>
+                            <a:ext cx="5486400" cy="3086100"/>
                           </a:xfrm>
                           <a:prstGeom prst="rect">
                             <a:avLst/>
@@ -15956,10 +15956,10 @@
               </w:rPr>
               <w:lastRenderedPageBreak/>
               <w:drawing>
-                <wp:inline distT="0" distB="0" distL="0" distR="0" wp14:anchorId="519BFD7E" wp14:editId="6858A4E9">
-                  <wp:extent cx="5120640" cy="3125474"/>
+                <wp:inline distT="0" distB="0" distL="0" distR="0" wp14:anchorId="5A7B913E" wp14:editId="517FED29">
+                  <wp:extent cx="5486400" cy="3086100"/>
                   <wp:effectExtent l="0" t="0" r="0" b="0"/>
-                  <wp:docPr id="17" name="Picture 17"/>
+                  <wp:docPr id="28" name="Picture 28"/>
                   <wp:cNvGraphicFramePr>
                     <a:graphicFrameLocks xmlns:a="http://schemas.openxmlformats.org/drawingml/2006/main" noChangeAspect="1"/>
                   </wp:cNvGraphicFramePr>
@@ -15979,7 +15979,7 @@
                         <pic:spPr>
                           <a:xfrm>
                             <a:off x="0" y="0"/>
-                            <a:ext cx="5120640" cy="3125474"/>
+                            <a:ext cx="5486400" cy="3086100"/>
                           </a:xfrm>
                           <a:prstGeom prst="rect">
                             <a:avLst/>
@@ -16162,10 +16162,10 @@
                 <w:noProof/>
               </w:rPr>
               <w:drawing>
-                <wp:inline distT="0" distB="0" distL="0" distR="0" wp14:anchorId="2BBB6C31" wp14:editId="50325CB5">
-                  <wp:extent cx="5120640" cy="3125474"/>
+                <wp:inline distT="0" distB="0" distL="0" distR="0" wp14:anchorId="33BA1E7A" wp14:editId="06300D55">
+                  <wp:extent cx="5486400" cy="3086100"/>
                   <wp:effectExtent l="0" t="0" r="0" b="0"/>
-                  <wp:docPr id="18" name="Picture 18"/>
+                  <wp:docPr id="29" name="Picture 29"/>
                   <wp:cNvGraphicFramePr>
                     <a:graphicFrameLocks xmlns:a="http://schemas.openxmlformats.org/drawingml/2006/main" noChangeAspect="1"/>
                   </wp:cNvGraphicFramePr>
@@ -16185,7 +16185,7 @@
                         <pic:spPr>
                           <a:xfrm>
                             <a:off x="0" y="0"/>
-                            <a:ext cx="5120640" cy="3125474"/>
+                            <a:ext cx="5486400" cy="3086100"/>
                           </a:xfrm>
                           <a:prstGeom prst="rect">
                             <a:avLst/>
@@ -16338,10 +16338,10 @@
                 <w:noProof/>
               </w:rPr>
               <w:drawing>
-                <wp:inline distT="0" distB="0" distL="0" distR="0" wp14:anchorId="371B5B7A" wp14:editId="2F913B5A">
-                  <wp:extent cx="5120640" cy="3125474"/>
+                <wp:inline distT="0" distB="0" distL="0" distR="0" wp14:anchorId="7C7C35A4" wp14:editId="4422C485">
+                  <wp:extent cx="5486400" cy="3086100"/>
                   <wp:effectExtent l="0" t="0" r="0" b="0"/>
-                  <wp:docPr id="19" name="Picture 19"/>
+                  <wp:docPr id="30" name="Picture 30"/>
                   <wp:cNvGraphicFramePr>
                     <a:graphicFrameLocks xmlns:a="http://schemas.openxmlformats.org/drawingml/2006/main" noChangeAspect="1"/>
                   </wp:cNvGraphicFramePr>
@@ -16361,7 +16361,7 @@
                         <pic:spPr>
                           <a:xfrm>
                             <a:off x="0" y="0"/>
-                            <a:ext cx="5120640" cy="3125474"/>
+                            <a:ext cx="5486400" cy="3086100"/>
                           </a:xfrm>
                           <a:prstGeom prst="rect">
                             <a:avLst/>
@@ -16514,10 +16514,10 @@
               </w:rPr>
               <w:lastRenderedPageBreak/>
               <w:drawing>
-                <wp:inline distT="0" distB="0" distL="0" distR="0" wp14:anchorId="719EB1FA" wp14:editId="701EAC31">
-                  <wp:extent cx="5120640" cy="3125474"/>
+                <wp:inline distT="0" distB="0" distL="0" distR="0" wp14:anchorId="04DA0A8C" wp14:editId="3BD34360">
+                  <wp:extent cx="5486400" cy="3086100"/>
                   <wp:effectExtent l="0" t="0" r="0" b="0"/>
-                  <wp:docPr id="20" name="Picture 20"/>
+                  <wp:docPr id="31" name="Picture 31"/>
                   <wp:cNvGraphicFramePr>
                     <a:graphicFrameLocks xmlns:a="http://schemas.openxmlformats.org/drawingml/2006/main" noChangeAspect="1"/>
                   </wp:cNvGraphicFramePr>
@@ -16537,7 +16537,7 @@
                         <pic:spPr>
                           <a:xfrm>
                             <a:off x="0" y="0"/>
-                            <a:ext cx="5120640" cy="3125474"/>
+                            <a:ext cx="5486400" cy="3086100"/>
                           </a:xfrm>
                           <a:prstGeom prst="rect">
                             <a:avLst/>
@@ -17629,10 +17629,10 @@
               </w:rPr>
               <w:lastRenderedPageBreak/>
               <w:drawing>
-                <wp:inline distT="0" distB="0" distL="0" distR="0" wp14:anchorId="63C0D50D" wp14:editId="77BA3A4C">
-                  <wp:extent cx="5120640" cy="2880360"/>
+                <wp:inline distT="0" distB="0" distL="0" distR="0" wp14:anchorId="32CC7B4A" wp14:editId="69A28F4F">
+                  <wp:extent cx="5486400" cy="3086100"/>
                   <wp:effectExtent l="0" t="0" r="0" b="0"/>
-                  <wp:docPr id="21" name="Picture 21"/>
+                  <wp:docPr id="32" name="Picture 32"/>
                   <wp:cNvGraphicFramePr>
                     <a:graphicFrameLocks xmlns:a="http://schemas.openxmlformats.org/drawingml/2006/main" noChangeAspect="1"/>
                   </wp:cNvGraphicFramePr>
@@ -17652,7 +17652,7 @@
                         <pic:spPr>
                           <a:xfrm>
                             <a:off x="0" y="0"/>
-                            <a:ext cx="5120640" cy="2880360"/>
+                            <a:ext cx="5486400" cy="3086100"/>
                           </a:xfrm>
                           <a:prstGeom prst="rect">
                             <a:avLst/>
@@ -17769,10 +17769,10 @@
                 <w:noProof/>
               </w:rPr>
               <w:drawing>
-                <wp:inline distT="0" distB="0" distL="0" distR="0" wp14:anchorId="3E5B6900" wp14:editId="53D7F459">
-                  <wp:extent cx="5120640" cy="2880360"/>
+                <wp:inline distT="0" distB="0" distL="0" distR="0" wp14:anchorId="1C60CA34" wp14:editId="4839F413">
+                  <wp:extent cx="5486400" cy="3086100"/>
                   <wp:effectExtent l="0" t="0" r="0" b="0"/>
-                  <wp:docPr id="22" name="Picture 22"/>
+                  <wp:docPr id="33" name="Picture 33"/>
                   <wp:cNvGraphicFramePr>
                     <a:graphicFrameLocks xmlns:a="http://schemas.openxmlformats.org/drawingml/2006/main" noChangeAspect="1"/>
                   </wp:cNvGraphicFramePr>
@@ -17792,7 +17792,7 @@
                         <pic:spPr>
                           <a:xfrm>
                             <a:off x="0" y="0"/>
-                            <a:ext cx="5120640" cy="2880360"/>
+                            <a:ext cx="5486400" cy="3086100"/>
                           </a:xfrm>
                           <a:prstGeom prst="rect">
                             <a:avLst/>

</xml_diff>